<commit_message>
[REPO] Maintain aggregate assessment and remove stale playtest gates
</commit_message>
<xml_diff>
--- a/README.docx
+++ b/README.docx
@@ -4,180 +4,98 @@
   <w:body>
     <w:p>
       <w:pPr>
-        <w:pStyle w:val="Title"/>
+        <w:pStyle w:val="Heading1"/>
       </w:pPr>
       <w:r>
-        <w:rPr>
-          <w:rFonts w:ascii="Aptos" w:hAnsi="Aptos"/>
-          <w:b w:val="0"/>
-          <w:sz w:val="21"/>
-        </w:rPr>
         <w:t>Colonist Awareness Overhaul</w:t>
       </w:r>
     </w:p>
+    <w:p/>
     <w:p>
-      <w:pPr>
-        <w:pStyle w:val="Subtitle"/>
-        <w:spacing w:after="280"/>
-      </w:pPr>
       <w:r>
-        <w:t>Current canonical project overview</w:t>
+        <w:t>Colonist Awareness is a RimWorld 1.6 framework and simulation overhaul. Pawns</w:t>
       </w:r>
     </w:p>
     <w:p>
       <w:r>
-        <w:rPr>
-          <w:rFonts w:ascii="Aptos" w:hAnsi="Aptos"/>
-          <w:b w:val="0"/>
-          <w:sz w:val="21"/>
-        </w:rPr>
-        <w:t>Colonist Awareness is a RimWorld 1.6 framework and simulation overhaul. Pawns act on what they know. Settlements persist as real places with people, supplies, institutions, beliefs, and authority. Factions make decisions and carry their consequences forward instead of resetting to isolated game events.</w:t>
+        <w:t>act on what they know. Settlements persist as real places with people, supplies,</w:t>
       </w:r>
     </w:p>
     <w:p>
       <w:r>
-        <w:rPr>
-          <w:rFonts w:ascii="Aptos" w:hAnsi="Aptos"/>
-          <w:b w:val="0"/>
-          <w:sz w:val="21"/>
-        </w:rPr>
-        <w:t xml:space="preserve">Current version: </w:t>
-      </w:r>
-      <w:r>
-        <w:rPr>
-          <w:rFonts w:ascii="Consolas" w:hAnsi="Consolas"/>
-          <w:b w:val="0"/>
-          <w:color w:val="50406E"/>
-          <w:sz w:val="18"/>
-        </w:rPr>
-        <w:t>1.6.1.0-alpha</w:t>
-      </w:r>
-      <w:r>
-        <w:rPr>
-          <w:rFonts w:ascii="Aptos" w:hAnsi="Aptos"/>
-          <w:b w:val="0"/>
-          <w:sz w:val="21"/>
-        </w:rPr>
-        <w:t xml:space="preserve">. Implementation is complete through batch </w:t>
-      </w:r>
-      <w:r>
-        <w:rPr>
-          <w:rFonts w:ascii="Consolas" w:hAnsi="Consolas"/>
-          <w:b w:val="0"/>
-          <w:color w:val="50406E"/>
-          <w:sz w:val="18"/>
-        </w:rPr>
-        <w:t>B16</w:t>
-      </w:r>
-      <w:r>
-        <w:rPr>
-          <w:rFonts w:ascii="Aptos" w:hAnsi="Aptos"/>
-          <w:b w:val="0"/>
-          <w:sz w:val="21"/>
-        </w:rPr>
-        <w:t xml:space="preserve">; </w:t>
-      </w:r>
-      <w:r>
-        <w:rPr>
-          <w:rFonts w:ascii="Consolas" w:hAnsi="Consolas"/>
-          <w:b w:val="0"/>
-          <w:color w:val="50406E"/>
-          <w:sz w:val="18"/>
-        </w:rPr>
-        <w:t>B17</w:t>
-      </w:r>
-      <w:r>
-        <w:rPr>
-          <w:rFonts w:ascii="Aptos" w:hAnsi="Aptos"/>
-          <w:b w:val="0"/>
-          <w:sz w:val="21"/>
-        </w:rPr>
-        <w:t xml:space="preserve"> is the next development batch. SESSION_STATE records the verified assembly and live deployment state. Static verification does not substitute for how the game looks and plays.</w:t>
-      </w:r>
-    </w:p>
-    <w:p>
-      <w:pPr>
-        <w:pStyle w:val="Heading1"/>
-      </w:pPr>
-      <w:r>
-        <w:rPr>
-          <w:rFonts w:ascii="Aptos" w:hAnsi="Aptos"/>
-          <w:b w:val="0"/>
-          <w:sz w:val="21"/>
-        </w:rPr>
-        <w:t>Framework</w:t>
+        <w:t>institutions, beliefs, and authority. Factions make decisions and carry their</w:t>
       </w:r>
     </w:p>
     <w:p>
       <w:r>
-        <w:rPr>
-          <w:rFonts w:ascii="Aptos" w:hAnsi="Aptos"/>
-          <w:b w:val="0"/>
-          <w:sz w:val="21"/>
-        </w:rPr>
-        <w:t>Every CA behavior composes four independent concerns:</w:t>
+        <w:t>consequences forward instead of resetting to isolated game events.</w:t>
+      </w:r>
+    </w:p>
+    <w:p/>
+    <w:p>
+      <w:r>
+        <w:t>&lt;!-- cao:generated:version BEGIN --&gt;</w:t>
       </w:r>
     </w:p>
     <w:p>
       <w:r>
-        <w:rPr>
-          <w:rFonts w:ascii="Consolas" w:hAnsi="Consolas"/>
-          <w:b w:val="0"/>
-          <w:color w:val="50406E"/>
-          <w:sz w:val="18"/>
-        </w:rPr>
-        <w:t>Knowledge triggers -&gt; Disposition ranks -&gt; Authority channels -&gt; Doctrine executes</w:t>
+        <w:t>Current version: `1.7.2.0-alpha`. Closed batch history reaches `B19`; `B20` is the current development batch. SESSION_STATE records the current implementation, deployment and aggregate capability assessment.</w:t>
       </w:r>
     </w:p>
+    <w:p>
+      <w:r>
+        <w:t>&lt;!-- cao:generated:version END --&gt;</w:t>
+      </w:r>
+    </w:p>
+    <w:p/>
+    <w:p>
+      <w:pPr>
+        <w:pStyle w:val="Heading2"/>
+      </w:pPr>
+      <w:r>
+        <w:t>Framework</w:t>
+      </w:r>
+    </w:p>
+    <w:p/>
+    <w:p>
+      <w:r>
+        <w:t>Every CA behavior composes four independent concerns:</w:t>
+      </w:r>
+    </w:p>
+    <w:p/>
+    <w:p>
+      <w:r>
+        <w:t>`Knowledge triggers -&gt; Disposition ranks -&gt; Authority channels -&gt; Doctrine executes`</w:t>
+      </w:r>
+    </w:p>
+    <w:p/>
     <w:tbl>
       <w:tblPr>
-        <w:tblStyle w:val="LightShading-Accent1"/>
+        <w:tblStyle w:val="TableGrid"/>
         <w:tblW w:type="auto" w:w="0"/>
-        <w:jc w:val="center"/>
-        <w:tblLayout w:type="autofit"/>
         <w:tblLook w:firstColumn="1" w:firstRow="1" w:lastColumn="0" w:lastRow="0" w:noHBand="0" w:noVBand="1" w:val="04A0"/>
       </w:tblPr>
       <w:tblGrid>
-        <w:gridCol w:w="5040"/>
-        <w:gridCol w:w="5040"/>
+        <w:gridCol w:w="4320"/>
+        <w:gridCol w:w="4320"/>
       </w:tblGrid>
       <w:tr>
         <w:tc>
           <w:tcPr>
-            <w:tcW w:type="dxa" w:w="5040"/>
-            <w:vAlign w:val="center"/>
+            <w:tcW w:type="dxa" w:w="4320"/>
           </w:tcPr>
           <w:p>
-            <w:pPr>
-              <w:keepLines/>
-              <w:spacing w:after="20"/>
-            </w:pPr>
             <w:r>
-              <w:rPr>
-                <w:rFonts w:ascii="Aptos" w:hAnsi="Aptos"/>
-                <w:b/>
-                <w:sz w:val="17"/>
-              </w:rPr>
               <w:t>Concern</w:t>
             </w:r>
           </w:p>
         </w:tc>
         <w:tc>
           <w:tcPr>
-            <w:tcW w:type="dxa" w:w="5040"/>
-            <w:vAlign w:val="center"/>
+            <w:tcW w:type="dxa" w:w="4320"/>
           </w:tcPr>
           <w:p>
-            <w:pPr>
-              <w:keepLines/>
-              <w:spacing w:after="20"/>
-            </w:pPr>
             <w:r>
-              <w:rPr>
-                <w:rFonts w:ascii="Aptos" w:hAnsi="Aptos"/>
-                <w:b/>
-                <w:sz w:val="17"/>
-              </w:rPr>
               <w:t>Owns</w:t>
             </w:r>
           </w:p>
@@ -186,40 +104,20 @@
       <w:tr>
         <w:tc>
           <w:tcPr>
-            <w:tcW w:type="dxa" w:w="5040"/>
-            <w:vAlign w:val="center"/>
+            <w:tcW w:type="dxa" w:w="4320"/>
           </w:tcPr>
           <w:p>
-            <w:pPr>
-              <w:keepLines/>
-              <w:spacing w:after="20"/>
-            </w:pPr>
             <w:r>
-              <w:rPr>
-                <w:rFonts w:ascii="Aptos" w:hAnsi="Aptos"/>
-                <w:b w:val="0"/>
-                <w:sz w:val="17"/>
-              </w:rPr>
               <w:t>Disposition</w:t>
             </w:r>
           </w:p>
         </w:tc>
         <w:tc>
           <w:tcPr>
-            <w:tcW w:type="dxa" w:w="5040"/>
-            <w:vAlign w:val="center"/>
+            <w:tcW w:type="dxa" w:w="4320"/>
           </w:tcPr>
           <w:p>
-            <w:pPr>
-              <w:keepLines/>
-              <w:spacing w:after="20"/>
-            </w:pPr>
             <w:r>
-              <w:rPr>
-                <w:rFonts w:ascii="Aptos" w:hAnsi="Aptos"/>
-                <w:b w:val="0"/>
-                <w:sz w:val="17"/>
-              </w:rPr>
               <w:t>Individual judgment, willingness, and risk texture.</w:t>
             </w:r>
           </w:p>
@@ -228,40 +126,20 @@
       <w:tr>
         <w:tc>
           <w:tcPr>
-            <w:tcW w:type="dxa" w:w="5040"/>
-            <w:vAlign w:val="center"/>
+            <w:tcW w:type="dxa" w:w="4320"/>
           </w:tcPr>
           <w:p>
-            <w:pPr>
-              <w:keepLines/>
-              <w:spacing w:after="20"/>
-            </w:pPr>
             <w:r>
-              <w:rPr>
-                <w:rFonts w:ascii="Aptos" w:hAnsi="Aptos"/>
-                <w:b w:val="0"/>
-                <w:sz w:val="17"/>
-              </w:rPr>
               <w:t>Knowledge</w:t>
             </w:r>
           </w:p>
         </w:tc>
         <w:tc>
           <w:tcPr>
-            <w:tcW w:type="dxa" w:w="5040"/>
-            <w:vAlign w:val="center"/>
+            <w:tcW w:type="dxa" w:w="4320"/>
           </w:tcPr>
           <w:p>
-            <w:pPr>
-              <w:keepLines/>
-              <w:spacing w:after="20"/>
-            </w:pPr>
             <w:r>
-              <w:rPr>
-                <w:rFonts w:ascii="Aptos" w:hAnsi="Aptos"/>
-                <w:b w:val="0"/>
-                <w:sz w:val="17"/>
-              </w:rPr>
               <w:t>Actor-held facts, observation, provenance, communication, memory, and uncertainty.</w:t>
             </w:r>
           </w:p>
@@ -270,40 +148,20 @@
       <w:tr>
         <w:tc>
           <w:tcPr>
-            <w:tcW w:type="dxa" w:w="5040"/>
-            <w:vAlign w:val="center"/>
+            <w:tcW w:type="dxa" w:w="4320"/>
           </w:tcPr>
           <w:p>
-            <w:pPr>
-              <w:keepLines/>
-              <w:spacing w:after="20"/>
-            </w:pPr>
             <w:r>
-              <w:rPr>
-                <w:rFonts w:ascii="Aptos" w:hAnsi="Aptos"/>
-                <w:b w:val="0"/>
-                <w:sz w:val="17"/>
-              </w:rPr>
               <w:t>Authority</w:t>
             </w:r>
           </w:p>
         </w:tc>
         <w:tc>
           <w:tcPr>
-            <w:tcW w:type="dxa" w:w="5040"/>
-            <w:vAlign w:val="center"/>
+            <w:tcW w:type="dxa" w:w="4320"/>
           </w:tcPr>
           <w:p>
-            <w:pPr>
-              <w:keepLines/>
-              <w:spacing w:after="20"/>
-            </w:pPr>
             <w:r>
-              <w:rPr>
-                <w:rFonts w:ascii="Aptos" w:hAnsi="Aptos"/>
-                <w:b w:val="0"/>
-                <w:sz w:val="17"/>
-              </w:rPr>
               <w:t>Permission, command, responsibility, organizations, institutions, and political order.</w:t>
             </w:r>
           </w:p>
@@ -312,281 +170,578 @@
       <w:tr>
         <w:tc>
           <w:tcPr>
-            <w:tcW w:type="dxa" w:w="5040"/>
-            <w:vAlign w:val="center"/>
+            <w:tcW w:type="dxa" w:w="4320"/>
           </w:tcPr>
           <w:p>
-            <w:pPr>
-              <w:keepLines/>
-              <w:spacing w:after="20"/>
-            </w:pPr>
             <w:r>
-              <w:rPr>
-                <w:rFonts w:ascii="Aptos" w:hAnsi="Aptos"/>
-                <w:b w:val="0"/>
-                <w:sz w:val="17"/>
-              </w:rPr>
               <w:t>Doctrine</w:t>
             </w:r>
           </w:p>
         </w:tc>
         <w:tc>
           <w:tcPr>
-            <w:tcW w:type="dxa" w:w="5040"/>
-            <w:vAlign w:val="center"/>
+            <w:tcW w:type="dxa" w:w="4320"/>
           </w:tcPr>
           <w:p>
-            <w:pPr>
-              <w:keepLines/>
-              <w:spacing w:after="20"/>
-            </w:pPr>
             <w:r>
-              <w:rPr>
-                <w:rFonts w:ascii="Aptos" w:hAnsi="Aptos"/>
-                <w:b w:val="0"/>
-                <w:sz w:val="17"/>
-              </w:rPr>
               <w:t>Native RimWorld jobs, duties, Lords, movement, combat, care, and material execution.</w:t>
             </w:r>
           </w:p>
         </w:tc>
       </w:tr>
     </w:tbl>
-    <w:p>
-      <w:pPr>
-        <w:spacing w:after="20"/>
-      </w:pPr>
-    </w:p>
+    <w:p/>
     <w:p>
       <w:r>
-        <w:rPr>
-          <w:rFonts w:ascii="Aptos" w:hAnsi="Aptos"/>
-          <w:b w:val="0"/>
-          <w:sz w:val="21"/>
-        </w:rPr>
-        <w:t>Standard retains ordinary RimWorld agency, enabled safeguards, direct and accepted relayed orders, and continuation of owned work. Proactive permits one bounded response to a current fact. Autonomous permits persistent or coordinated action inside delegated or institutional authority. Initiative never creates knowledge, permission, office, materials, or capability, and direct player orders remain authoritative at every tier.</w:t>
-      </w:r>
-    </w:p>
-    <w:p>
-      <w:pPr>
-        <w:pStyle w:val="Heading1"/>
-      </w:pPr>
-      <w:r>
-        <w:rPr>
-          <w:rFonts w:ascii="Aptos" w:hAnsi="Aptos"/>
-          <w:b w:val="0"/>
-          <w:sz w:val="21"/>
-        </w:rPr>
-        <w:t>World and founding authoring</w:t>
+        <w:t>Standard retains ordinary RimWorld agency, enabled safeguards, direct and</w:t>
       </w:r>
     </w:p>
     <w:p>
       <w:r>
-        <w:rPr>
-          <w:rFonts w:ascii="Aptos" w:hAnsi="Aptos"/>
-          <w:b w:val="0"/>
-          <w:sz w:val="21"/>
-        </w:rPr>
-        <w:t>Starting Region authors direct world facts: the selected region and arrival area, factions, settlements, population composition, ownership and relations, and explicit exceptional starting conditions. Region lists the factions and settlements already present, Map owns spatial selection and area assignment, and Details edits the selected region, faction, or settlement. One valid option is shown as a fact only when it matters, not as a button, and generation provenance remains diagnostic rather than player copy.</w:t>
+        <w:t>accepted relayed orders, and continuation of owned work. Proactive permits one</w:t>
       </w:r>
     </w:p>
     <w:p>
       <w:r>
-        <w:rPr>
-          <w:rFonts w:ascii="Aptos" w:hAnsi="Aptos"/>
-          <w:b w:val="0"/>
-          <w:sz w:val="21"/>
-        </w:rPr>
-        <w:t>Settlement scale, access, services, civic capacity, and material composition are realized from actual population, land, geography, knowledge, institutions, economy, trade, work, and history. An open registry defines 22 possible program contracts across housing, food, storage, medicine, production, trade, governance, security, defense, research, religion, social life, culture, agriculture, communications, and transport. A program becomes active only when its concrete need, operator, standing, knowledge, labor, materials, target, access, funding or maintenance, behavior, and failure contract are represented. Unsupported programs stay absent. Buildings and rooms are nodes used by a program; they do not prove an institution exists.</w:t>
+        <w:t>bounded response to a current fact. Autonomous permits persistent or coordinated</w:t>
       </w:r>
     </w:p>
     <w:p>
       <w:r>
-        <w:rPr>
-          <w:rFonts w:ascii="Aptos" w:hAnsi="Aptos"/>
-          <w:b w:val="0"/>
-          <w:sz w:val="21"/>
-        </w:rPr>
-        <w:t>Domestic provision belongs to a real pawn or a persistent domestic unit formed from represented partner, kin, residence, or explicit co-residence facts. Pawn ordering and hashes never create a household. Communal and authority provisions require real organizations, workers, stock, access, funding, and distribution; tax-funded provision also requires an adopted tax policy and collection. Practiced capability is a domain evidence summary over actual actors, organizations, work, knowledge, materials, and history, without random jitter. World tendencies guide or summarize their owning facts and do not create the institutions they describe.</w:t>
+        <w:t>action inside delegated or institutional authority. Initiative never creates</w:t>
       </w:r>
     </w:p>
     <w:p>
       <w:r>
-        <w:rPr>
-          <w:rFonts w:ascii="Aptos" w:hAnsi="Aptos"/>
-          <w:b w:val="0"/>
-          <w:sz w:val="21"/>
-        </w:rPr>
-        <w:t xml:space="preserve">Biome and terrain are also causal. The selected ground derives explicit requirements for shelter, temperature control, food, reserves, medicine, safe water, light, environmental protection, and breathable space. Advanced populations may consider hostile ground, but established settlements must satisfy its requirements through their actual programs and faction capability. Frontier residents appear only after the smaller site has materialized its supported habitat; unsupported frontier hazard and vacuum sites fail closed. Autonomous construction ranks otherwise valid candidates by composable functional, circulation, expansion, environmental, defensive, material, and visual-order evidence drawn from </w:t>
-      </w:r>
-      <w:r>
-        <w:rPr>
-          <w:rFonts w:ascii="Consolas" w:hAnsi="Consolas"/>
-          <w:b w:val="0"/>
-          <w:color w:val="50406E"/>
-          <w:sz w:val="18"/>
-        </w:rPr>
-        <w:t>PLAYER_BASE_PATTERN_CORPUS.md</w:t>
-      </w:r>
-      <w:r>
-        <w:rPr>
-          <w:rFonts w:ascii="Aptos" w:hAnsi="Aptos"/>
-          <w:b w:val="0"/>
-          <w:sz w:val="21"/>
-        </w:rPr>
-        <w:t xml:space="preserve">, without a style toggle or copied base plan. One extractor now normalizes full </w:t>
-      </w:r>
-      <w:r>
-        <w:rPr>
-          <w:rFonts w:ascii="Consolas" w:hAnsi="Consolas"/>
-          <w:b w:val="0"/>
-          <w:color w:val="50406E"/>
-          <w:sz w:val="18"/>
-        </w:rPr>
-        <w:t>.rws</w:t>
-      </w:r>
-      <w:r>
-        <w:rPr>
-          <w:rFonts w:ascii="Aptos" w:hAnsi="Aptos"/>
-          <w:b w:val="0"/>
-          <w:sz w:val="21"/>
-        </w:rPr>
-        <w:t xml:space="preserve"> saves and structured Real Ruins </w:t>
-      </w:r>
-      <w:r>
-        <w:rPr>
-          <w:rFonts w:ascii="Consolas" w:hAnsi="Consolas"/>
-          <w:b w:val="0"/>
-          <w:color w:val="50406E"/>
-          <w:sz w:val="18"/>
-        </w:rPr>
-        <w:t>.bp</w:t>
-      </w:r>
-      <w:r>
-        <w:rPr>
-          <w:rFonts w:ascii="Aptos" w:hAnsi="Aptos"/>
-          <w:b w:val="0"/>
-          <w:sz w:val="21"/>
-        </w:rPr>
-        <w:t xml:space="preserve"> snapshots. The operator's early/combat-precarity evidence remains distinct from broad anonymous layout screening and from the complementary mature mid/end-game evidence it does not supply. The current broad screen contains 4,238 complete byte-unique layouts across 80 biome definitions, with a portable exact cohort manifest and lineage-safe experimental partitions; source-truncated fragments remain quarantined from complete-base evidence.</w:t>
+        <w:t>knowledge, permission, office, materials, or capability, and direct player orders</w:t>
       </w:r>
     </w:p>
     <w:p>
       <w:r>
-        <w:rPr>
-          <w:rFonts w:ascii="Aptos" w:hAnsi="Aptos"/>
-          <w:b w:val="0"/>
-          <w:sz w:val="21"/>
-        </w:rPr>
-        <w:t>Culture is persistent social history with substantive inherited state. Its current admitted authoring registry is a population distribution over forty-eight explicit questions in twelve categories: relationships, family, and sexuality; gender and social authority; status and hierarchy; membership and outsiders; public authority and social order; property, labor, and provision; violence, captivity, and punishment; knowledge and tradition; body, health, and death; food and substances; animals and environment; and daily life and technology. Each question has five ordered anchors, a center, population spread, norm and evidence settings, provenance, historical feedback, and material consumers. The registry is the current result of a reverse audit from playable Core, DLC, CA, and explicitly supported-mod mechanics; its size is not a permanent quota. Concrete social subjects remain factual referents; practices remain repeated conduct with actors, conditions, authority, materials, evidence, and consumers. Neither is silently promoted into a Culture question.</w:t>
+        <w:t>remain authoritative at every tier.</w:t>
+      </w:r>
+    </w:p>
+    <w:p/>
+    <w:p>
+      <w:pPr>
+        <w:pStyle w:val="Heading2"/>
+      </w:pPr>
+      <w:r>
+        <w:t>World and founding authoring</w:t>
+      </w:r>
+    </w:p>
+    <w:p/>
+    <w:p>
+      <w:r>
+        <w:t>Starting Region authors direct world facts: the selected region and arrival</w:t>
       </w:r>
     </w:p>
     <w:p>
       <w:r>
-        <w:rPr>
-          <w:rFonts w:ascii="Aptos" w:hAnsi="Aptos"/>
-          <w:b w:val="0"/>
-          <w:sz w:val="21"/>
-        </w:rPr>
-        <w:t>The Culture composer groups all twelve categories, exposes one Overall disagreement control, and keeps per-value disagreement under More. Twenty-two complete historical and social presets across the Americas, Europe, and Asia, manual editing, saved profiles, and deterministic randomization all write the same Culture object; there is no preset mode or blend state. It also exposes constituents, inherited and current concrete practices, historical evidence, continuity, and the optional native visual style. Exact values round-trip without loss. At runtime a pawn receives a deterministic private position, public expression, attention, inherited-prior strength, perceived social pressure, observation likelihood, knowledge confidence, moral conviction, and uncertainty. Question-specific psychology contributes a small bounded private deviation. Sparse represented influence may change those attitudes over time. Direct historical observations persist measured position, spread, represented population, continuity, and source identity before stable pawn appraisal; expertise deference uses demonstrated skill in the factual subject's explicit domain. One event, unchanged evidence, or opening an editor cannot manufacture a Culture change.</w:t>
+        <w:t>area, factions, settlements, population composition, ownership and relations,</w:t>
       </w:r>
     </w:p>
     <w:p>
       <w:r>
-        <w:rPr>
-          <w:rFonts w:ascii="Aptos" w:hAnsi="Aptos"/>
-          <w:b w:val="0"/>
-          <w:sz w:val="21"/>
-        </w:rPr>
-        <w:t>Persistent psychology, Culture, native Ideoligion, Political Order, represented institutions, proposition knowledge, actions, and practices remain separate causes and owners. Culture contributes appraisal and the selection of otherwise valid discretionary CA action. It does not override direct player intent or create knowledge, permission, authority, resources, technology, office, land, relationships, institutions, or completed research. Regional pawn appraisal retains the exact settlement institution resolved from the pawn's represented population assignment; local social history and institutional jurisdiction are not reconstructed from faction membership.</w:t>
+        <w:t>and explicit exceptional starting conditions. Region lists the factions and</w:t>
       </w:r>
     </w:p>
     <w:p>
       <w:r>
-        <w:rPr>
-          <w:rFonts w:ascii="Aptos" w:hAnsi="Aptos"/>
-          <w:b w:val="0"/>
-          <w:sz w:val="21"/>
-        </w:rPr>
-        <w:t xml:space="preserve">Each authored faction also owns one Technological Knowledge composition beside its Culture and Political Order. Nine practical domains separately record what the faction can understand, construct, operate, and maintain. Native research, buildings, recipes, crops, habitat requirements, and autonomous development use one explicit translation into those domains. </w:t>
-      </w:r>
-      <w:r>
-        <w:rPr>
-          <w:rFonts w:ascii="Consolas" w:hAnsi="Consolas"/>
-          <w:b w:val="0"/>
-          <w:color w:val="50406E"/>
-          <w:sz w:val="18"/>
-        </w:rPr>
-        <w:t>FactionDef.techLevel</w:t>
-      </w:r>
-      <w:r>
-        <w:rPr>
-          <w:rFonts w:ascii="Aptos" w:hAnsi="Aptos"/>
-          <w:b w:val="0"/>
-          <w:sz w:val="21"/>
-        </w:rPr>
-        <w:t xml:space="preserve"> may seed a new unauthored faction once and remains a pre-world compatibility fallback; it does not remain the authority after faction state exists. Environmental needs, available knowledge, labor, materials, and realized facilities remain separate causes. Current execution consumers and unused forward-capacity cells are enumerated separately in the B15 consumer matrix.</w:t>
+        <w:t>settlements already present, Map owns spatial selection and area assignment,</w:t>
       </w:r>
     </w:p>
     <w:p>
       <w:r>
-        <w:rPr>
-          <w:rFonts w:ascii="Aptos" w:hAnsi="Aptos"/>
-          <w:b w:val="0"/>
-          <w:sz w:val="21"/>
-        </w:rPr>
+        <w:t>and Details edits the selected region, faction, or settlement. One valid option</w:t>
+      </w:r>
+    </w:p>
+    <w:p>
+      <w:r>
+        <w:t>is shown as a fact only when it matters, not as a button, and generation</w:t>
+      </w:r>
+    </w:p>
+    <w:p>
+      <w:r>
+        <w:t>provenance remains diagnostic rather than player copy.</w:t>
+      </w:r>
+    </w:p>
+    <w:p/>
+    <w:p>
+      <w:r>
+        <w:t>Settlement scale, access, services, civic capacity, and material composition are</w:t>
+      </w:r>
+    </w:p>
+    <w:p>
+      <w:r>
+        <w:t>realized from actual population, land, geography, knowledge, institutions,</w:t>
+      </w:r>
+    </w:p>
+    <w:p>
+      <w:r>
+        <w:t>economy, trade, work, and history. An open registry defines 22 possible program</w:t>
+      </w:r>
+    </w:p>
+    <w:p>
+      <w:r>
+        <w:t>contracts across housing, food, storage, medicine, production, trade,</w:t>
+      </w:r>
+    </w:p>
+    <w:p>
+      <w:r>
+        <w:t>governance, security, defense, research, religion, social life, culture,</w:t>
+      </w:r>
+    </w:p>
+    <w:p>
+      <w:r>
+        <w:t>agriculture, communications, and transport. A program becomes active only when</w:t>
+      </w:r>
+    </w:p>
+    <w:p>
+      <w:r>
+        <w:t>its concrete need, operator, standing, knowledge, labor, materials, target,</w:t>
+      </w:r>
+    </w:p>
+    <w:p>
+      <w:r>
+        <w:t>access, funding or maintenance, behavior, and failure contract are represented.</w:t>
+      </w:r>
+    </w:p>
+    <w:p>
+      <w:r>
+        <w:t>Unsupported programs stay absent. Buildings and rooms are nodes used by a</w:t>
+      </w:r>
+    </w:p>
+    <w:p>
+      <w:r>
+        <w:t>program; they do not prove an institution exists.</w:t>
+      </w:r>
+    </w:p>
+    <w:p/>
+    <w:p>
+      <w:r>
+        <w:t>Domestic provision belongs to a real pawn or a persistent domestic unit formed</w:t>
+      </w:r>
+    </w:p>
+    <w:p>
+      <w:r>
+        <w:t>from represented partner, kin, residence, or explicit co-residence facts. Pawn</w:t>
+      </w:r>
+    </w:p>
+    <w:p>
+      <w:r>
+        <w:t>ordering and hashes never create a household. Communal and authority provisions</w:t>
+      </w:r>
+    </w:p>
+    <w:p>
+      <w:r>
+        <w:t>require real organizations, workers, stock, access, funding, and distribution;</w:t>
+      </w:r>
+    </w:p>
+    <w:p>
+      <w:r>
+        <w:t>tax-funded provision also requires an adopted tax policy and collection.</w:t>
+      </w:r>
+    </w:p>
+    <w:p>
+      <w:r>
+        <w:t>Practiced capability is a domain evidence summary over actual actors,</w:t>
+      </w:r>
+    </w:p>
+    <w:p>
+      <w:r>
+        <w:t>organizations, work, knowledge, materials, and history, without random jitter.</w:t>
+      </w:r>
+    </w:p>
+    <w:p>
+      <w:r>
+        <w:t>World tendencies guide or summarize their owning facts and do not create the</w:t>
+      </w:r>
+    </w:p>
+    <w:p>
+      <w:r>
+        <w:t>institutions they describe.</w:t>
+      </w:r>
+    </w:p>
+    <w:p/>
+    <w:p>
+      <w:r>
+        <w:t>Biome and terrain are also causal. The selected ground derives explicit</w:t>
+      </w:r>
+    </w:p>
+    <w:p>
+      <w:r>
+        <w:t>requirements for shelter, temperature control, food, reserves, medicine, safe</w:t>
+      </w:r>
+    </w:p>
+    <w:p>
+      <w:r>
+        <w:t>water, light, environmental protection, and breathable space. Advanced</w:t>
+      </w:r>
+    </w:p>
+    <w:p>
+      <w:r>
+        <w:t>populations may consider hostile ground, but established settlements must</w:t>
+      </w:r>
+    </w:p>
+    <w:p>
+      <w:r>
+        <w:t>satisfy its requirements through their actual programs and faction capability.</w:t>
+      </w:r>
+    </w:p>
+    <w:p>
+      <w:r>
+        <w:t>Frontier residents appear only after the smaller site has materialized its</w:t>
+      </w:r>
+    </w:p>
+    <w:p>
+      <w:r>
+        <w:t>supported habitat; unsupported frontier hazard and vacuum sites fail closed.</w:t>
+      </w:r>
+    </w:p>
+    <w:p>
+      <w:r>
+        <w:t>Autonomous construction ranks otherwise valid candidates by composable</w:t>
+      </w:r>
+    </w:p>
+    <w:p>
+      <w:r>
+        <w:t>functional, circulation, expansion, environmental, defensive, material, and</w:t>
+      </w:r>
+    </w:p>
+    <w:p>
+      <w:r>
+        <w:t>visual-order evidence drawn from `PLAYER_BASE_PATTERN_CORPUS.md`, without a</w:t>
+      </w:r>
+    </w:p>
+    <w:p>
+      <w:r>
+        <w:t>style toggle or copied base plan. One extractor now normalizes full `.rws` saves</w:t>
+      </w:r>
+    </w:p>
+    <w:p>
+      <w:r>
+        <w:t>and structured Real Ruins `.bp` snapshots. The operator's early/combat-precarity</w:t>
+      </w:r>
+    </w:p>
+    <w:p>
+      <w:r>
+        <w:t>evidence remains distinct from broad anonymous layout screening and from the</w:t>
+      </w:r>
+    </w:p>
+    <w:p>
+      <w:r>
+        <w:t>complementary mature mid/end-game evidence it does not supply. The current broad</w:t>
+      </w:r>
+    </w:p>
+    <w:p>
+      <w:r>
+        <w:t>screen contains 4,238 complete byte-unique layouts across 80 biome definitions,</w:t>
+      </w:r>
+    </w:p>
+    <w:p>
+      <w:r>
+        <w:t>with an exact local cohort manifest and lineage-safe experimental partitions;</w:t>
+      </w:r>
+    </w:p>
+    <w:p>
+      <w:r>
+        <w:t>the repository publishes only aggregate evidence and dataset governance, while</w:t>
+      </w:r>
+    </w:p>
+    <w:p>
+      <w:r>
+        <w:t>source-truncated fragments remain quarantined from complete-base evidence.</w:t>
+      </w:r>
+    </w:p>
+    <w:p/>
+    <w:p>
+      <w:r>
+        <w:t>Culture is persistent social history with substantive inherited state. Its</w:t>
+      </w:r>
+    </w:p>
+    <w:p>
+      <w:r>
+        <w:t>current admitted authoring registry is a population distribution over</w:t>
+      </w:r>
+    </w:p>
+    <w:p>
+      <w:r>
+        <w:t>forty-eight explicit questions in twelve categories: relationships, family, and</w:t>
+      </w:r>
+    </w:p>
+    <w:p>
+      <w:r>
+        <w:t>sexuality; gender and social authority; status and hierarchy; membership and</w:t>
+      </w:r>
+    </w:p>
+    <w:p>
+      <w:r>
+        <w:t>outsiders; public authority and social order; property, labor, and provision;</w:t>
+      </w:r>
+    </w:p>
+    <w:p>
+      <w:r>
+        <w:t>violence, captivity, and punishment; knowledge and tradition; body, health, and</w:t>
+      </w:r>
+    </w:p>
+    <w:p>
+      <w:r>
+        <w:t>death; food and substances; animals and environment; and daily life and</w:t>
+      </w:r>
+    </w:p>
+    <w:p>
+      <w:r>
+        <w:t>technology. Each question has five ordered anchors, a center,</w:t>
+      </w:r>
+    </w:p>
+    <w:p>
+      <w:r>
+        <w:t>population spread, norm and evidence settings, provenance, historical feedback,</w:t>
+      </w:r>
+    </w:p>
+    <w:p>
+      <w:r>
+        <w:t>and material consumers. The registry is the current result of a reverse audit</w:t>
+      </w:r>
+    </w:p>
+    <w:p>
+      <w:r>
+        <w:t>from playable Core, DLC, CA, and explicitly supported-mod mechanics; its size is</w:t>
+      </w:r>
+    </w:p>
+    <w:p>
+      <w:r>
+        <w:t>not a permanent quota. Concrete social subjects remain factual referents;</w:t>
+      </w:r>
+    </w:p>
+    <w:p>
+      <w:r>
+        <w:t>practices remain repeated conduct with actors, conditions, authority, materials,</w:t>
+      </w:r>
+    </w:p>
+    <w:p>
+      <w:r>
+        <w:t>evidence, and consumers. Neither is silently promoted into a Culture question.</w:t>
+      </w:r>
+    </w:p>
+    <w:p/>
+    <w:p>
+      <w:r>
+        <w:t>The Culture composer groups all twelve categories, exposes one Overall</w:t>
+      </w:r>
+    </w:p>
+    <w:p>
+      <w:r>
+        <w:t>disagreement control, and keeps per-value disagreement under More. Twenty-two</w:t>
+      </w:r>
+    </w:p>
+    <w:p>
+      <w:r>
+        <w:t>complete historical and social presets across the Americas, Europe, and Asia,</w:t>
+      </w:r>
+    </w:p>
+    <w:p>
+      <w:r>
+        <w:t>manual editing, saved profiles, and</w:t>
+      </w:r>
+    </w:p>
+    <w:p>
+      <w:r>
+        <w:t>deterministic randomization all write the same Culture object; there is no</w:t>
+      </w:r>
+    </w:p>
+    <w:p>
+      <w:r>
+        <w:t>preset mode or blend state. It also exposes constituents, inherited and current</w:t>
+      </w:r>
+    </w:p>
+    <w:p>
+      <w:r>
+        <w:t>concrete practices, historical evidence, continuity, and the optional native</w:t>
+      </w:r>
+    </w:p>
+    <w:p>
+      <w:r>
+        <w:t>visual style. Exact values round-trip without loss. At runtime a pawn</w:t>
+      </w:r>
+    </w:p>
+    <w:p>
+      <w:r>
+        <w:t>receives a deterministic private position, public expression, attention,</w:t>
+      </w:r>
+    </w:p>
+    <w:p>
+      <w:r>
+        <w:t>inherited-prior strength, perceived social pressure, observation likelihood,</w:t>
+      </w:r>
+    </w:p>
+    <w:p>
+      <w:r>
+        <w:t>knowledge confidence, moral conviction, and uncertainty. Question-specific</w:t>
+      </w:r>
+    </w:p>
+    <w:p>
+      <w:r>
+        <w:t>psychology contributes a small bounded private deviation. Sparse represented</w:t>
+      </w:r>
+    </w:p>
+    <w:p>
+      <w:r>
+        <w:t>influence may change those attitudes over time. Direct historical observations</w:t>
+      </w:r>
+    </w:p>
+    <w:p>
+      <w:r>
+        <w:t>persist measured position, spread, represented population, continuity, and</w:t>
+      </w:r>
+    </w:p>
+    <w:p>
+      <w:r>
+        <w:t>source identity before stable pawn appraisal; expertise deference uses</w:t>
+      </w:r>
+    </w:p>
+    <w:p>
+      <w:r>
+        <w:t>demonstrated skill in the factual subject's explicit domain. One event,</w:t>
+      </w:r>
+    </w:p>
+    <w:p>
+      <w:r>
+        <w:t>unchanged evidence, or opening an editor cannot manufacture a Culture change.</w:t>
+      </w:r>
+    </w:p>
+    <w:p/>
+    <w:p>
+      <w:r>
+        <w:t>Persistent psychology, Culture, native Ideoligion, Political Order, represented</w:t>
+      </w:r>
+    </w:p>
+    <w:p>
+      <w:r>
+        <w:t>institutions, proposition knowledge, actions, and practices remain</w:t>
+      </w:r>
+    </w:p>
+    <w:p>
+      <w:r>
+        <w:t>separate causes and owners. Culture contributes appraisal and the selection of</w:t>
+      </w:r>
+    </w:p>
+    <w:p>
+      <w:r>
+        <w:t>otherwise valid discretionary CA action. It does not override direct player</w:t>
+      </w:r>
+    </w:p>
+    <w:p>
+      <w:r>
+        <w:t>intent or create knowledge, permission, authority, resources, technology,</w:t>
+      </w:r>
+    </w:p>
+    <w:p>
+      <w:r>
+        <w:t>office, land, relationships, institutions, or completed research.</w:t>
+      </w:r>
+    </w:p>
+    <w:p>
+      <w:r>
+        <w:t>Regional pawn appraisal retains the exact settlement institution resolved from</w:t>
+      </w:r>
+    </w:p>
+    <w:p>
+      <w:r>
+        <w:t>the pawn's represented population assignment; local social history and</w:t>
+      </w:r>
+    </w:p>
+    <w:p>
+      <w:r>
+        <w:t>institutional jurisdiction are not reconstructed from faction membership.</w:t>
+      </w:r>
+    </w:p>
+    <w:p/>
+    <w:p>
+      <w:r>
+        <w:t>Each authored faction also owns one Technological Knowledge composition beside</w:t>
+      </w:r>
+    </w:p>
+    <w:p>
+      <w:r>
+        <w:t>its Culture and Political Order. Nine practical domains separately record what</w:t>
+      </w:r>
+    </w:p>
+    <w:p>
+      <w:r>
+        <w:t>the faction can understand, construct, operate, and maintain. Native research,</w:t>
+      </w:r>
+    </w:p>
+    <w:p>
+      <w:r>
+        <w:t>buildings, recipes, crops, habitat requirements, and autonomous development use</w:t>
+      </w:r>
+    </w:p>
+    <w:p>
+      <w:r>
+        <w:t>one explicit translation into those domains. `FactionDef.techLevel` may seed a</w:t>
+      </w:r>
+    </w:p>
+    <w:p>
+      <w:r>
+        <w:t>new unauthored faction once and remains a pre-world compatibility fallback; it</w:t>
+      </w:r>
+    </w:p>
+    <w:p>
+      <w:r>
+        <w:t>does not remain the authority after faction state exists. Environmental needs,</w:t>
+      </w:r>
+    </w:p>
+    <w:p>
+      <w:r>
+        <w:t>available knowledge, labor, materials, and realized facilities remain separate</w:t>
+      </w:r>
+    </w:p>
+    <w:p>
+      <w:r>
+        <w:t>causes. Current execution consumers and unused forward-capacity cells are</w:t>
+      </w:r>
+    </w:p>
+    <w:p>
+      <w:r>
+        <w:t>enumerated separately in the B15 consumer matrix.</w:t>
+      </w:r>
+    </w:p>
+    <w:p/>
+    <w:p>
+      <w:r>
         <w:t>The same concepts have different temporal meanings on the two creation sides:</w:t>
       </w:r>
     </w:p>
+    <w:p/>
     <w:tbl>
       <w:tblPr>
-        <w:tblStyle w:val="LightShading-Accent1"/>
+        <w:tblStyle w:val="TableGrid"/>
         <w:tblW w:type="auto" w:w="0"/>
-        <w:jc w:val="center"/>
-        <w:tblLayout w:type="autofit"/>
         <w:tblLook w:firstColumn="1" w:firstRow="1" w:lastColumn="0" w:lastRow="0" w:noHBand="0" w:noVBand="1" w:val="04A0"/>
       </w:tblPr>
       <w:tblGrid>
-        <w:gridCol w:w="5040"/>
-        <w:gridCol w:w="5040"/>
+        <w:gridCol w:w="4320"/>
+        <w:gridCol w:w="4320"/>
       </w:tblGrid>
       <w:tr>
         <w:tc>
           <w:tcPr>
-            <w:tcW w:type="dxa" w:w="5040"/>
-            <w:vAlign w:val="center"/>
+            <w:tcW w:type="dxa" w:w="4320"/>
           </w:tcPr>
           <w:p>
-            <w:pPr>
-              <w:keepLines/>
-              <w:spacing w:after="20"/>
-            </w:pPr>
             <w:r>
-              <w:rPr>
-                <w:rFonts w:ascii="Aptos" w:hAnsi="Aptos"/>
-                <w:b/>
-                <w:sz w:val="17"/>
-              </w:rPr>
               <w:t>Existing society</w:t>
             </w:r>
           </w:p>
         </w:tc>
         <w:tc>
           <w:tcPr>
-            <w:tcW w:type="dxa" w:w="5040"/>
-            <w:vAlign w:val="center"/>
+            <w:tcW w:type="dxa" w:w="4320"/>
           </w:tcPr>
           <w:p>
-            <w:pPr>
-              <w:keepLines/>
-              <w:spacing w:after="20"/>
-            </w:pPr>
             <w:r>
-              <w:rPr>
-                <w:rFonts w:ascii="Aptos" w:hAnsi="Aptos"/>
-                <w:b/>
-                <w:sz w:val="17"/>
-              </w:rPr>
               <w:t>Player founding</w:t>
             </w:r>
           </w:p>
@@ -595,102 +750,348 @@
       <w:tr>
         <w:tc>
           <w:tcPr>
-            <w:tcW w:type="dxa" w:w="5040"/>
-            <w:vAlign w:val="center"/>
+            <w:tcW w:type="dxa" w:w="4320"/>
           </w:tcPr>
           <w:p>
-            <w:pPr>
-              <w:keepLines/>
-              <w:spacing w:after="20"/>
-            </w:pPr>
             <w:r>
-              <w:rPr>
-                <w:rFonts w:ascii="Aptos" w:hAnsi="Aptos"/>
-                <w:b w:val="0"/>
-                <w:sz w:val="17"/>
-              </w:rPr>
               <w:t>Culture, Ideoligion, Political Order, represented institutions, material state, and established historical basis are facts about a society already present.</w:t>
             </w:r>
           </w:p>
         </w:tc>
         <w:tc>
           <w:tcPr>
-            <w:tcW w:type="dxa" w:w="5040"/>
-            <w:vAlign w:val="center"/>
+            <w:tcW w:type="dxa" w:w="4320"/>
           </w:tcPr>
           <w:p>
-            <w:pPr>
-              <w:keepLines/>
-              <w:spacing w:after="20"/>
-            </w:pPr>
             <w:r>
-              <w:rPr>
-                <w:rFonts w:ascii="Aptos" w:hAnsi="Aptos"/>
-                <w:b w:val="0"/>
-                <w:sz w:val="17"/>
-              </w:rPr>
               <w:t>Founders bring inherited Culture, native Ideoligion, and Political Order, then choose the rules instituted at landing. Local institutions and historical Culture develop through play.</w:t>
             </w:r>
           </w:p>
         </w:tc>
       </w:tr>
     </w:tbl>
-    <w:p>
-      <w:pPr>
-        <w:spacing w:after="20"/>
-      </w:pPr>
-    </w:p>
+    <w:p/>
     <w:p>
       <w:r>
-        <w:rPr>
-          <w:rFonts w:ascii="Aptos" w:hAnsi="Aptos"/>
-          <w:b w:val="0"/>
-          <w:sz w:val="21"/>
-        </w:rPr>
-        <w:t>Society is the shared control surface above the separate component composers. It edits the faction's Culture, Political Order, and Technological Knowledge together without becoming another state owner. Each independently named Society preset carries a complete reusable snapshot of those three components. Applying one validates all three copies, commits them atomically into the faction's ordinary state, and retains no preset key or Society ownership. Each component remains independently editable, and its own preset browser is an optional component-replacement action rather than a parallel Society workflow. The same surface saves reusable three-component user presets. Applying one to an established faction does not rewrite represented institutions; applying one to the founders does not choose Ideoligion or rules at landing. Starting Region may use the same preset while creating an ordinary local faction and settlement; the page separately records its scenario population and map-area assignment. No settlement type, catalog ownership, or preset mode is retained.</w:t>
+        <w:t>Society is the shared control surface above the separate component composers.</w:t>
       </w:r>
     </w:p>
     <w:p>
       <w:r>
-        <w:rPr>
-          <w:rFonts w:ascii="Aptos" w:hAnsi="Aptos"/>
-          <w:b w:val="0"/>
-          <w:sz w:val="21"/>
-        </w:rPr>
-        <w:t>Standard play reads the faction's Technological Knowledge directly. Experimental Distributed Knowledge changes only where that same knowledge is available: living pawns, institutions, and records carry domain competencies, redundancy protects them, and the loss or incapacity of an isolated carrier can remove a practical capability. Recruitment, departure, research, and represented custody changes operate on the same ontology; teaching is not yet a shipped transfer mechanism. The mode does not create a second technology system.</w:t>
+        <w:t>It edits the faction's Culture, Political Order, and Technological Knowledge</w:t>
       </w:r>
     </w:p>
     <w:p>
       <w:r>
-        <w:rPr>
-          <w:rFonts w:ascii="Aptos" w:hAnsi="Aptos"/>
-          <w:b w:val="0"/>
-          <w:sz w:val="21"/>
-        </w:rPr>
-        <w:t>Political Order is a complete normative composition over twenty-six concrete questions covering authority, civic life, ownership by economic domain, exchange, work, provision, and security. Blendable questions distribute 100 points among compatible positions; exclusive questions select one answer. Eight complete presets and deterministic generation fill that same editable state. The configured variables generate the order's name, short summary, and political account; an optional custom display name never substitutes prose for the causal model. Existing institutions are shown as separate represented facts instead of a duplicate editable axis grid. During play, pawn political attitudes remain a separate realized state formed from Culture, psychology, Ideoligion, material interest, institutional experience, threat, held beliefs, proposition knowledge, and represented issue networks. Faction-bounded coalitions can emerge from that state without rewriting Political Order or represented institutions.</w:t>
+        <w:t>together without becoming another state owner. Each independently named Society</w:t>
       </w:r>
     </w:p>
     <w:p>
       <w:r>
-        <w:rPr>
-          <w:rFonts w:ascii="Aptos" w:hAnsi="Aptos"/>
-          <w:b w:val="0"/>
-          <w:sz w:val="21"/>
-        </w:rPr>
-        <w:t>RimWorld's native Ideoligion chooser remains first-class inside this coordinated flow. Native presets, saved Ideoligions, fixed and fluid creation, memes, precepts, roles, rituals, validation, and persistence remain native. CA preserves the neighboring Culture, Political Order, and founding-order draft when the player enters and returns from that chooser. Political Order states what a population considers proper; adopted rules and observed practice state what is actually in force. Agreement and contradiction both remain meaningful state.</w:t>
+        <w:t>preset carries a complete reusable snapshot of those three components. Applying</w:t>
       </w:r>
     </w:p>
     <w:p>
+      <w:r>
+        <w:t>one validates all three copies, commits them atomically into the faction's</w:t>
+      </w:r>
+    </w:p>
+    <w:p>
+      <w:r>
+        <w:t>ordinary state, and retains no preset key or Society ownership. Each component</w:t>
+      </w:r>
+    </w:p>
+    <w:p>
+      <w:r>
+        <w:t>remains independently editable, and its own preset browser is an optional</w:t>
+      </w:r>
+    </w:p>
+    <w:p>
+      <w:r>
+        <w:t>component-replacement action rather than a parallel Society workflow. The same</w:t>
+      </w:r>
+    </w:p>
+    <w:p>
+      <w:r>
+        <w:t>surface saves reusable three-component user presets. Applying one to an</w:t>
+      </w:r>
+    </w:p>
+    <w:p>
+      <w:r>
+        <w:t>established faction does not rewrite represented institutions; applying one to</w:t>
+      </w:r>
+    </w:p>
+    <w:p>
+      <w:r>
+        <w:t>the founders does not choose Ideoligion or rules at landing. Starting Region may</w:t>
+      </w:r>
+    </w:p>
+    <w:p>
+      <w:r>
+        <w:t>use the same preset while creating an ordinary local faction and settlement;</w:t>
+      </w:r>
+    </w:p>
+    <w:p>
+      <w:r>
+        <w:t>the page separately records its scenario population and map-area assignment.</w:t>
+      </w:r>
+    </w:p>
+    <w:p>
+      <w:r>
+        <w:t>No settlement type, catalog ownership, or preset mode is retained.</w:t>
+      </w:r>
+    </w:p>
+    <w:p/>
+    <w:p>
+      <w:r>
+        <w:t>Standard play reads the effective social owner's Technological Knowledge</w:t>
+      </w:r>
+    </w:p>
+    <w:p>
+      <w:r>
+        <w:t>directly: the faction for a non-divergent owned site, or the site's canonical</w:t>
+      </w:r>
+    </w:p>
+    <w:p>
+      <w:r>
+        <w:t>local state when factionless or explicitly divergent. Experimental Distributed</w:t>
+      </w:r>
+    </w:p>
+    <w:p>
+      <w:r>
+        <w:t>Knowledge changes only where that same knowledge is available:</w:t>
+      </w:r>
+    </w:p>
+    <w:p>
+      <w:r>
+        <w:t>living pawns, institutions, and records carry domain competencies, redundancy</w:t>
+      </w:r>
+    </w:p>
+    <w:p>
+      <w:r>
+        <w:t>protects them, and the loss or incapacity of an isolated carrier can remove a</w:t>
+      </w:r>
+    </w:p>
+    <w:p>
+      <w:r>
+        <w:t>practical capability. Recruitment, departure, research, and represented custody</w:t>
+      </w:r>
+    </w:p>
+    <w:p>
+      <w:r>
+        <w:t>changes operate on the same ontology; teaching is not yet a shipped transfer</w:t>
+      </w:r>
+    </w:p>
+    <w:p>
+      <w:r>
+        <w:t>mechanism. The mode does not create a second technology system.</w:t>
+      </w:r>
+    </w:p>
+    <w:p/>
+    <w:p>
+      <w:r>
+        <w:t>Every persistent inhabited site separately records faction ownership and</w:t>
+      </w:r>
+    </w:p>
+    <w:p>
+      <w:r>
+        <w:t>material support. Major settlements and existing frontier settlements,</w:t>
+      </w:r>
+    </w:p>
+    <w:p>
+      <w:r>
+        <w:t>holdings, cabins, and homesteads share this relationship contract without losing</w:t>
+      </w:r>
+    </w:p>
+    <w:p>
+      <w:r>
+        <w:t>their distinct mechanics. `No faction` is a complete ownership value. Support,</w:t>
+      </w:r>
+    </w:p>
+    <w:p>
+      <w:r>
+        <w:t>resident affiliation, Culture, Ideoligion, Political Order, Technological</w:t>
+      </w:r>
+    </w:p>
+    <w:p>
+      <w:r>
+        <w:t>Knowledge, institutions, organizations, offices, local authority, programs,</w:t>
+      </w:r>
+    </w:p>
+    <w:p>
+      <w:r>
+        <w:t>provisions, and practice remain separate facts. Factionless sites therefore</w:t>
+      </w:r>
+    </w:p>
+    <w:p>
+      <w:r>
+        <w:t>retain complete local social state and can develop without a faction appearing</w:t>
+      </w:r>
+    </w:p>
+    <w:p>
+      <w:r>
+        <w:t>at a scale transition.</w:t>
+      </w:r>
+    </w:p>
+    <w:p/>
+    <w:p>
+      <w:r>
+        <w:t>The default-off Broader Pawn Knowledge mode extends the existing proposition</w:t>
+      </w:r>
+    </w:p>
+    <w:p>
+      <w:r>
+        <w:t>store to represented people, sites, affiliation, social state, events,</w:t>
+      </w:r>
+    </w:p>
+    <w:p>
+      <w:r>
+        <w:t>technology, geography, and routes. Each pawn keeps a separate typed record with</w:t>
+      </w:r>
+    </w:p>
+    <w:p>
+      <w:r>
+        <w:t>source age, confidence, uncertainty, reporter, contradiction, revision,</w:t>
+      </w:r>
+    </w:p>
+    <w:p>
+      <w:r>
+        <w:t>supersession, scope, retention, and provenance where meaningful. A report copies</w:t>
+      </w:r>
+    </w:p>
+    <w:p>
+      <w:r>
+        <w:t>what the teller remembers; it never gives the receiver refreshed world truth.</w:t>
+      </w:r>
+    </w:p>
+    <w:p>
+      <w:r>
+        <w:t>The pawn inspector describes the pawn's belief and evidence. Existing required</w:t>
+      </w:r>
+    </w:p>
+    <w:p>
+      <w:r>
+        <w:t>tactical and welfare knowledge remains unchanged when this broader mode is off.</w:t>
+      </w:r>
+    </w:p>
+    <w:p/>
+    <w:p>
+      <w:r>
+        <w:t>Political Order is a complete normative composition over twenty-six concrete</w:t>
+      </w:r>
+    </w:p>
+    <w:p>
+      <w:r>
+        <w:t>questions covering authority, civic life, ownership by economic domain,</w:t>
+      </w:r>
+    </w:p>
+    <w:p>
+      <w:r>
+        <w:t>exchange, work, provision, and security. Blendable questions distribute 100</w:t>
+      </w:r>
+    </w:p>
+    <w:p>
+      <w:r>
+        <w:t>points among compatible positions; exclusive questions select one answer. Eight</w:t>
+      </w:r>
+    </w:p>
+    <w:p>
+      <w:r>
+        <w:t>complete presets and deterministic generation fill that same editable state.</w:t>
+      </w:r>
+    </w:p>
+    <w:p>
+      <w:r>
+        <w:t>The configured variables generate the order's name, short summary, and political</w:t>
+      </w:r>
+    </w:p>
+    <w:p>
+      <w:r>
+        <w:t>account; an optional custom display name never substitutes prose for the causal</w:t>
+      </w:r>
+    </w:p>
+    <w:p>
+      <w:r>
+        <w:t>model. Existing institutions are shown as separate represented facts instead of</w:t>
+      </w:r>
+    </w:p>
+    <w:p>
+      <w:r>
+        <w:t>a duplicate editable axis grid. During play, pawn political attitudes remain</w:t>
+      </w:r>
+    </w:p>
+    <w:p>
+      <w:r>
+        <w:t>a separate realized state formed from Culture, psychology, Ideoligion, material</w:t>
+      </w:r>
+    </w:p>
+    <w:p>
+      <w:r>
+        <w:t>interest, institutional experience, threat, held beliefs, proposition knowledge,</w:t>
+      </w:r>
+    </w:p>
+    <w:p>
+      <w:r>
+        <w:t>and represented issue networks. Faction-bounded coalitions can emerge from that</w:t>
+      </w:r>
+    </w:p>
+    <w:p>
+      <w:r>
+        <w:t>state without rewriting Political Order or represented institutions.</w:t>
+      </w:r>
+    </w:p>
+    <w:p/>
+    <w:p>
+      <w:r>
+        <w:t>RimWorld's native Ideoligion chooser remains first-class inside this coordinated</w:t>
+      </w:r>
+    </w:p>
+    <w:p>
+      <w:r>
+        <w:t>flow. Native presets, saved Ideoligions, fixed and fluid creation, memes,</w:t>
+      </w:r>
+    </w:p>
+    <w:p>
+      <w:r>
+        <w:t>precepts, roles, rituals, validation, and persistence remain native. CA preserves</w:t>
+      </w:r>
+    </w:p>
+    <w:p>
+      <w:r>
+        <w:t>the neighboring Culture, Political Order, and founding-order draft when the</w:t>
+      </w:r>
+    </w:p>
+    <w:p>
+      <w:r>
+        <w:t>player enters and returns from that chooser. Political Order states what a</w:t>
+      </w:r>
+    </w:p>
+    <w:p>
+      <w:r>
+        <w:t>population considers proper; adopted rules and observed practice state what is</w:t>
+      </w:r>
+    </w:p>
+    <w:p>
+      <w:r>
+        <w:t>actually in force. Agreement and contradiction both remain meaningful state.</w:t>
+      </w:r>
+    </w:p>
+    <w:p/>
+    <w:p>
       <w:pPr>
-        <w:pStyle w:val="Heading1"/>
+        <w:pStyle w:val="Heading2"/>
       </w:pPr>
       <w:r>
-        <w:rPr>
-          <w:rFonts w:ascii="Aptos" w:hAnsi="Aptos"/>
-          <w:b w:val="0"/>
-          <w:sz w:val="21"/>
-        </w:rPr>
         <w:t>Requirements</w:t>
+      </w:r>
+    </w:p>
+    <w:p/>
+    <w:p>
+      <w:pPr>
+        <w:pStyle w:val="ListBullet"/>
+      </w:pPr>
+      <w:r>
+        <w:t>RimWorld `1.6`</w:t>
       </w:r>
     </w:p>
     <w:p>
@@ -698,33 +1099,6 @@
         <w:pStyle w:val="ListBullet"/>
       </w:pPr>
       <w:r>
-        <w:rPr>
-          <w:rFonts w:ascii="Aptos" w:hAnsi="Aptos"/>
-          <w:b w:val="0"/>
-          <w:sz w:val="21"/>
-        </w:rPr>
-        <w:t xml:space="preserve">RimWorld </w:t>
-      </w:r>
-      <w:r>
-        <w:rPr>
-          <w:rFonts w:ascii="Consolas" w:hAnsi="Consolas"/>
-          <w:b w:val="0"/>
-          <w:color w:val="50406E"/>
-          <w:sz w:val="18"/>
-        </w:rPr>
-        <w:t>1.6</w:t>
-      </w:r>
-    </w:p>
-    <w:p>
-      <w:pPr>
-        <w:pStyle w:val="ListBullet"/>
-      </w:pPr>
-      <w:r>
-        <w:rPr>
-          <w:rFonts w:ascii="Aptos" w:hAnsi="Aptos"/>
-          <w:b w:val="0"/>
-          <w:sz w:val="21"/>
-        </w:rPr>
         <w:t>Harmony</w:t>
       </w:r>
     </w:p>
@@ -733,11 +1107,6 @@
         <w:pStyle w:val="ListBullet"/>
       </w:pPr>
       <w:r>
-        <w:rPr>
-          <w:rFonts w:ascii="Aptos" w:hAnsi="Aptos"/>
-          <w:b w:val="0"/>
-          <w:sz w:val="21"/>
-        </w:rPr>
         <w:t>Biotech</w:t>
       </w:r>
     </w:p>
@@ -746,183 +1115,93 @@
         <w:pStyle w:val="ListBullet"/>
       </w:pPr>
       <w:r>
-        <w:rPr>
-          <w:rFonts w:ascii="Aptos" w:hAnsi="Aptos"/>
-          <w:b w:val="0"/>
-          <w:sz w:val="21"/>
-        </w:rPr>
         <w:t>Ideology</w:t>
+      </w:r>
+    </w:p>
+    <w:p/>
+    <w:p>
+      <w:r>
+        <w:t>The stable package identifier is `ellyj3rain.colonistawareness`. Dependencies and</w:t>
       </w:r>
     </w:p>
     <w:p>
       <w:r>
-        <w:rPr>
-          <w:rFonts w:ascii="Aptos" w:hAnsi="Aptos"/>
-          <w:b w:val="0"/>
-          <w:sz w:val="21"/>
-        </w:rPr>
-        <w:t xml:space="preserve">The stable package identifier is </w:t>
+        <w:t>load order are declared in [`About/About.xml`](About/About.xml).</w:t>
       </w:r>
+    </w:p>
+    <w:p/>
+    <w:p>
+      <w:pPr>
+        <w:pStyle w:val="Heading2"/>
+      </w:pPr>
+      <w:r>
+        <w:t>Build</w:t>
+      </w:r>
+    </w:p>
+    <w:p/>
+    <w:p>
+      <w:r>
+        <w:t>From the project root:</w:t>
+      </w:r>
+    </w:p>
+    <w:p/>
+    <w:p>
       <w:r>
         <w:rPr>
           <w:rFonts w:ascii="Consolas" w:hAnsi="Consolas"/>
-          <w:b w:val="0"/>
-          <w:color w:val="50406E"/>
           <w:sz w:val="18"/>
         </w:rPr>
-        <w:t>ellyj3rain.colonistawareness</w:t>
-      </w:r>
-      <w:r>
-        <w:rPr>
-          <w:rFonts w:ascii="Aptos" w:hAnsi="Aptos"/>
-          <w:b w:val="0"/>
-          <w:sz w:val="21"/>
-        </w:rPr>
-        <w:t xml:space="preserve">. Dependencies and load order are declared in </w:t>
-      </w:r>
-      <w:hyperlink r:id="rId11">
-        <w:r>
-          <w:rPr>
-            <w:color w:val="2F5597"/>
-            <w:u w:val="single"/>
-          </w:rPr>
-          <w:t>`About/About.xml`</w:t>
-        </w:r>
-      </w:hyperlink>
-      <w:r>
-        <w:rPr>
-          <w:rFonts w:ascii="Aptos" w:hAnsi="Aptos"/>
-          <w:b w:val="0"/>
-          <w:sz w:val="21"/>
-        </w:rPr>
-        <w:t>.</w:t>
+        <w:t>dotnet build Source/ColonistAwareness.csproj -c Release</w:t>
       </w:r>
     </w:p>
+    <w:p/>
     <w:p>
-      <w:pPr>
-        <w:pStyle w:val="Heading1"/>
-      </w:pPr>
       <w:r>
-        <w:rPr>
-          <w:rFonts w:ascii="Aptos" w:hAnsi="Aptos"/>
-          <w:b w:val="0"/>
-          <w:sz w:val="21"/>
-        </w:rPr>
-        <w:t>Build</w:t>
+        <w:t>The Release assembly is written to `Assemblies/ColonistAwareness.dll`. DLL</w:t>
       </w:r>
     </w:p>
     <w:p>
       <w:r>
-        <w:rPr>
-          <w:rFonts w:ascii="Aptos" w:hAnsi="Aptos"/>
-          <w:b w:val="0"/>
-          <w:sz w:val="21"/>
-        </w:rPr>
-        <w:t>From the project root:</w:t>
+        <w:t>changes require a full RimWorld restart.</w:t>
       </w:r>
     </w:p>
+    <w:p/>
     <w:p>
       <w:pPr>
-        <w:ind w:left="360" w:right="216"/>
+        <w:pStyle w:val="Heading2"/>
       </w:pPr>
       <w:r>
-        <w:rPr>
-          <w:rFonts w:ascii="Consolas" w:hAnsi="Consolas"/>
-          <w:color w:val="37414B"/>
-          <w:sz w:val="17"/>
-        </w:rPr>
-        <w:t>dotnet build Source/ColonistAwareness.csproj -c Release</w:t>
-      </w:r>
-    </w:p>
-    <w:p>
-      <w:r>
-        <w:rPr>
-          <w:rFonts w:ascii="Aptos" w:hAnsi="Aptos"/>
-          <w:b w:val="0"/>
-          <w:sz w:val="21"/>
-        </w:rPr>
-        <w:t xml:space="preserve">The Release assembly is written to </w:t>
-      </w:r>
-      <w:r>
-        <w:rPr>
-          <w:rFonts w:ascii="Consolas" w:hAnsi="Consolas"/>
-          <w:b w:val="0"/>
-          <w:color w:val="50406E"/>
-          <w:sz w:val="18"/>
-        </w:rPr>
-        <w:t>Assemblies/ColonistAwareness.dll</w:t>
-      </w:r>
-      <w:r>
-        <w:rPr>
-          <w:rFonts w:ascii="Aptos" w:hAnsi="Aptos"/>
-          <w:b w:val="0"/>
-          <w:sz w:val="21"/>
-        </w:rPr>
-        <w:t>. DLL changes require a full RimWorld restart.</w:t>
-      </w:r>
-    </w:p>
-    <w:p>
-      <w:pPr>
-        <w:pStyle w:val="Heading1"/>
-      </w:pPr>
-      <w:r>
-        <w:rPr>
-          <w:rFonts w:ascii="Aptos" w:hAnsi="Aptos"/>
-          <w:b w:val="0"/>
-          <w:sz w:val="21"/>
-        </w:rPr>
         <w:t>Project map</w:t>
       </w:r>
     </w:p>
+    <w:p/>
     <w:tbl>
       <w:tblPr>
-        <w:tblStyle w:val="LightShading-Accent1"/>
+        <w:tblStyle w:val="TableGrid"/>
         <w:tblW w:type="auto" w:w="0"/>
-        <w:jc w:val="center"/>
-        <w:tblLayout w:type="autofit"/>
         <w:tblLook w:firstColumn="1" w:firstRow="1" w:lastColumn="0" w:lastRow="0" w:noHBand="0" w:noVBand="1" w:val="04A0"/>
       </w:tblPr>
       <w:tblGrid>
-        <w:gridCol w:w="5040"/>
-        <w:gridCol w:w="5040"/>
+        <w:gridCol w:w="4320"/>
+        <w:gridCol w:w="4320"/>
       </w:tblGrid>
       <w:tr>
         <w:tc>
           <w:tcPr>
-            <w:tcW w:type="dxa" w:w="5040"/>
-            <w:vAlign w:val="center"/>
+            <w:tcW w:type="dxa" w:w="4320"/>
           </w:tcPr>
           <w:p>
-            <w:pPr>
-              <w:keepLines/>
-              <w:spacing w:after="20"/>
-            </w:pPr>
             <w:r>
-              <w:rPr>
-                <w:rFonts w:ascii="Aptos" w:hAnsi="Aptos"/>
-                <w:b/>
-                <w:sz w:val="17"/>
-              </w:rPr>
               <w:t>Path</w:t>
             </w:r>
           </w:p>
         </w:tc>
         <w:tc>
           <w:tcPr>
-            <w:tcW w:type="dxa" w:w="5040"/>
-            <w:vAlign w:val="center"/>
+            <w:tcW w:type="dxa" w:w="4320"/>
           </w:tcPr>
           <w:p>
-            <w:pPr>
-              <w:keepLines/>
-              <w:spacing w:after="20"/>
-            </w:pPr>
             <w:r>
-              <w:rPr>
-                <w:rFonts w:ascii="Aptos" w:hAnsi="Aptos"/>
-                <w:b/>
-                <w:sz w:val="17"/>
-              </w:rPr>
               <w:t>Purpose</w:t>
             </w:r>
           </w:p>
@@ -931,41 +1210,20 @@
       <w:tr>
         <w:tc>
           <w:tcPr>
-            <w:tcW w:type="dxa" w:w="5040"/>
-            <w:vAlign w:val="center"/>
+            <w:tcW w:type="dxa" w:w="4320"/>
           </w:tcPr>
           <w:p>
-            <w:pPr>
-              <w:keepLines/>
-              <w:spacing w:after="20"/>
-            </w:pPr>
             <w:r>
-              <w:rPr>
-                <w:rFonts w:ascii="Consolas" w:hAnsi="Consolas"/>
-                <w:b w:val="0"/>
-                <w:color w:val="50406E"/>
-                <w:sz w:val="17"/>
-              </w:rPr>
-              <w:t>Source/</w:t>
+              <w:t>`Source/`</w:t>
             </w:r>
           </w:p>
         </w:tc>
         <w:tc>
           <w:tcPr>
-            <w:tcW w:type="dxa" w:w="5040"/>
-            <w:vAlign w:val="center"/>
+            <w:tcW w:type="dxa" w:w="4320"/>
           </w:tcPr>
           <w:p>
-            <w:pPr>
-              <w:keepLines/>
-              <w:spacing w:after="20"/>
-            </w:pPr>
             <w:r>
-              <w:rPr>
-                <w:rFonts w:ascii="Aptos" w:hAnsi="Aptos"/>
-                <w:b w:val="0"/>
-                <w:sz w:val="17"/>
-              </w:rPr>
               <w:t>C# implementation</w:t>
             </w:r>
           </w:p>
@@ -974,58 +1232,20 @@
       <w:tr>
         <w:tc>
           <w:tcPr>
-            <w:tcW w:type="dxa" w:w="5040"/>
-            <w:vAlign w:val="center"/>
+            <w:tcW w:type="dxa" w:w="4320"/>
           </w:tcPr>
           <w:p>
-            <w:pPr>
-              <w:keepLines/>
-              <w:spacing w:after="20"/>
-            </w:pPr>
             <w:r>
-              <w:rPr>
-                <w:rFonts w:ascii="Consolas" w:hAnsi="Consolas"/>
-                <w:b w:val="0"/>
-                <w:color w:val="50406E"/>
-                <w:sz w:val="17"/>
-              </w:rPr>
-              <w:t>Defs/</w:t>
-            </w:r>
-            <w:r>
-              <w:rPr>
-                <w:rFonts w:ascii="Aptos" w:hAnsi="Aptos"/>
-                <w:b w:val="0"/>
-                <w:sz w:val="17"/>
-              </w:rPr>
-              <w:t xml:space="preserve">, </w:t>
-            </w:r>
-            <w:r>
-              <w:rPr>
-                <w:rFonts w:ascii="Consolas" w:hAnsi="Consolas"/>
-                <w:b w:val="0"/>
-                <w:color w:val="50406E"/>
-                <w:sz w:val="17"/>
-              </w:rPr>
-              <w:t>Patches/</w:t>
+              <w:t>`Defs/`, `Patches/`</w:t>
             </w:r>
           </w:p>
         </w:tc>
         <w:tc>
           <w:tcPr>
-            <w:tcW w:type="dxa" w:w="5040"/>
-            <w:vAlign w:val="center"/>
+            <w:tcW w:type="dxa" w:w="4320"/>
           </w:tcPr>
           <w:p>
-            <w:pPr>
-              <w:keepLines/>
-              <w:spacing w:after="20"/>
-            </w:pPr>
             <w:r>
-              <w:rPr>
-                <w:rFonts w:ascii="Aptos" w:hAnsi="Aptos"/>
-                <w:b w:val="0"/>
-                <w:sz w:val="17"/>
-              </w:rPr>
               <w:t>RimWorld definitions and integration patches</w:t>
             </w:r>
           </w:p>
@@ -1034,41 +1254,20 @@
       <w:tr>
         <w:tc>
           <w:tcPr>
-            <w:tcW w:type="dxa" w:w="5040"/>
-            <w:vAlign w:val="center"/>
+            <w:tcW w:type="dxa" w:w="4320"/>
           </w:tcPr>
           <w:p>
-            <w:pPr>
-              <w:keepLines/>
-              <w:spacing w:after="20"/>
-            </w:pPr>
             <w:r>
-              <w:rPr>
-                <w:rFonts w:ascii="Consolas" w:hAnsi="Consolas"/>
-                <w:b w:val="0"/>
-                <w:color w:val="50406E"/>
-                <w:sz w:val="17"/>
-              </w:rPr>
-              <w:t>Languages/English/</w:t>
+              <w:t>`Languages/English/`</w:t>
             </w:r>
           </w:p>
         </w:tc>
         <w:tc>
           <w:tcPr>
-            <w:tcW w:type="dxa" w:w="5040"/>
-            <w:vAlign w:val="center"/>
+            <w:tcW w:type="dxa" w:w="4320"/>
           </w:tcPr>
           <w:p>
-            <w:pPr>
-              <w:keepLines/>
-              <w:spacing w:after="20"/>
-            </w:pPr>
             <w:r>
-              <w:rPr>
-                <w:rFonts w:ascii="Aptos" w:hAnsi="Aptos"/>
-                <w:b w:val="0"/>
-                <w:sz w:val="17"/>
-              </w:rPr>
               <w:t>Player-facing English text</w:t>
             </w:r>
           </w:p>
@@ -1077,41 +1276,20 @@
       <w:tr>
         <w:tc>
           <w:tcPr>
-            <w:tcW w:type="dxa" w:w="5040"/>
-            <w:vAlign w:val="center"/>
+            <w:tcW w:type="dxa" w:w="4320"/>
           </w:tcPr>
           <w:p>
-            <w:pPr>
-              <w:keepLines/>
-              <w:spacing w:after="20"/>
-            </w:pPr>
             <w:r>
-              <w:rPr>
-                <w:rFonts w:ascii="Consolas" w:hAnsi="Consolas"/>
-                <w:b w:val="0"/>
-                <w:color w:val="50406E"/>
-                <w:sz w:val="17"/>
-              </w:rPr>
-              <w:t>About/</w:t>
+              <w:t>`About/`</w:t>
             </w:r>
           </w:p>
         </w:tc>
         <w:tc>
           <w:tcPr>
-            <w:tcW w:type="dxa" w:w="5040"/>
-            <w:vAlign w:val="center"/>
+            <w:tcW w:type="dxa" w:w="4320"/>
           </w:tcPr>
           <w:p>
-            <w:pPr>
-              <w:keepLines/>
-              <w:spacing w:after="20"/>
-            </w:pPr>
             <w:r>
-              <w:rPr>
-                <w:rFonts w:ascii="Aptos" w:hAnsi="Aptos"/>
-                <w:b w:val="0"/>
-                <w:sz w:val="17"/>
-              </w:rPr>
               <w:t>Mod metadata and dependency declaration</w:t>
             </w:r>
           </w:p>
@@ -1120,41 +1298,20 @@
       <w:tr>
         <w:tc>
           <w:tcPr>
-            <w:tcW w:type="dxa" w:w="5040"/>
-            <w:vAlign w:val="center"/>
+            <w:tcW w:type="dxa" w:w="4320"/>
           </w:tcPr>
           <w:p>
-            <w:pPr>
-              <w:keepLines/>
-              <w:spacing w:after="20"/>
-            </w:pPr>
             <w:r>
-              <w:rPr>
-                <w:rFonts w:ascii="Consolas" w:hAnsi="Consolas"/>
-                <w:b w:val="0"/>
-                <w:color w:val="50406E"/>
-                <w:sz w:val="17"/>
-              </w:rPr>
-              <w:t>ARCHITECTURE.md</w:t>
+              <w:t>`ARCHITECTURE.md`</w:t>
             </w:r>
           </w:p>
         </w:tc>
         <w:tc>
           <w:tcPr>
-            <w:tcW w:type="dxa" w:w="5040"/>
-            <w:vAlign w:val="center"/>
+            <w:tcW w:type="dxa" w:w="4320"/>
           </w:tcPr>
           <w:p>
-            <w:pPr>
-              <w:keepLines/>
-              <w:spacing w:after="20"/>
-            </w:pPr>
             <w:r>
-              <w:rPr>
-                <w:rFonts w:ascii="Aptos" w:hAnsi="Aptos"/>
-                <w:b w:val="0"/>
-                <w:sz w:val="17"/>
-              </w:rPr>
               <w:t>Current framework architecture and ownership</w:t>
             </w:r>
           </w:p>
@@ -1163,41 +1320,20 @@
       <w:tr>
         <w:tc>
           <w:tcPr>
-            <w:tcW w:type="dxa" w:w="5040"/>
-            <w:vAlign w:val="center"/>
+            <w:tcW w:type="dxa" w:w="4320"/>
           </w:tcPr>
           <w:p>
-            <w:pPr>
-              <w:keepLines/>
-              <w:spacing w:after="20"/>
-            </w:pPr>
             <w:r>
-              <w:rPr>
-                <w:rFonts w:ascii="Consolas" w:hAnsi="Consolas"/>
-                <w:b w:val="0"/>
-                <w:color w:val="50406E"/>
-                <w:sz w:val="17"/>
-              </w:rPr>
-              <w:t>GOVERNANCE.md</w:t>
+              <w:t>`GOVERNANCE.md`</w:t>
             </w:r>
           </w:p>
         </w:tc>
         <w:tc>
           <w:tcPr>
-            <w:tcW w:type="dxa" w:w="5040"/>
-            <w:vAlign w:val="center"/>
+            <w:tcW w:type="dxa" w:w="4320"/>
           </w:tcPr>
           <w:p>
-            <w:pPr>
-              <w:keepLines/>
-              <w:spacing w:after="20"/>
-            </w:pPr>
             <w:r>
-              <w:rPr>
-                <w:rFonts w:ascii="Aptos" w:hAnsi="Aptos"/>
-                <w:b w:val="0"/>
-                <w:sz w:val="17"/>
-              </w:rPr>
               <w:t>Project operating rules</w:t>
             </w:r>
           </w:p>
@@ -1206,42 +1342,21 @@
       <w:tr>
         <w:tc>
           <w:tcPr>
-            <w:tcW w:type="dxa" w:w="5040"/>
-            <w:vAlign w:val="center"/>
+            <w:tcW w:type="dxa" w:w="4320"/>
           </w:tcPr>
           <w:p>
-            <w:pPr>
-              <w:keepLines/>
-              <w:spacing w:after="20"/>
-            </w:pPr>
             <w:r>
-              <w:rPr>
-                <w:rFonts w:ascii="Consolas" w:hAnsi="Consolas"/>
-                <w:b w:val="0"/>
-                <w:color w:val="50406E"/>
-                <w:sz w:val="17"/>
-              </w:rPr>
-              <w:t>SESSION_STATE.md</w:t>
+              <w:t>`SESSION_STATE.md`</w:t>
             </w:r>
           </w:p>
         </w:tc>
         <w:tc>
           <w:tcPr>
-            <w:tcW w:type="dxa" w:w="5040"/>
-            <w:vAlign w:val="center"/>
+            <w:tcW w:type="dxa" w:w="4320"/>
           </w:tcPr>
           <w:p>
-            <w:pPr>
-              <w:keepLines/>
-              <w:spacing w:after="20"/>
-            </w:pPr>
             <w:r>
-              <w:rPr>
-                <w:rFonts w:ascii="Aptos" w:hAnsi="Aptos"/>
-                <w:b w:val="0"/>
-                <w:sz w:val="17"/>
-              </w:rPr>
-              <w:t>Current build, deployment, fixture, and runtime-test boundary</w:t>
+              <w:t>Current implementation, deployment, fixture, and aggregate capability assessment</w:t>
             </w:r>
           </w:p>
         </w:tc>
@@ -1249,41 +1364,20 @@
       <w:tr>
         <w:tc>
           <w:tcPr>
-            <w:tcW w:type="dxa" w:w="5040"/>
-            <w:vAlign w:val="center"/>
+            <w:tcW w:type="dxa" w:w="4320"/>
           </w:tcPr>
           <w:p>
-            <w:pPr>
-              <w:keepLines/>
-              <w:spacing w:after="20"/>
-            </w:pPr>
             <w:r>
-              <w:rPr>
-                <w:rFonts w:ascii="Consolas" w:hAnsi="Consolas"/>
-                <w:b w:val="0"/>
-                <w:color w:val="50406E"/>
-                <w:sz w:val="17"/>
-              </w:rPr>
-              <w:t>Batches/</w:t>
+              <w:t>`Batches/`</w:t>
             </w:r>
           </w:p>
         </w:tc>
         <w:tc>
           <w:tcPr>
-            <w:tcW w:type="dxa" w:w="5040"/>
-            <w:vAlign w:val="center"/>
+            <w:tcW w:type="dxa" w:w="4320"/>
           </w:tcPr>
           <w:p>
-            <w:pPr>
-              <w:keepLines/>
-              <w:spacing w:after="20"/>
-            </w:pPr>
             <w:r>
-              <w:rPr>
-                <w:rFonts w:ascii="Aptos" w:hAnsi="Aptos"/>
-                <w:b w:val="0"/>
-                <w:sz w:val="17"/>
-              </w:rPr>
               <w:t>Append-only batch records in one alphanumeric namespace</w:t>
             </w:r>
           </w:p>
@@ -1292,41 +1386,20 @@
       <w:tr>
         <w:tc>
           <w:tcPr>
-            <w:tcW w:type="dxa" w:w="5040"/>
-            <w:vAlign w:val="center"/>
+            <w:tcW w:type="dxa" w:w="4320"/>
           </w:tcPr>
           <w:p>
-            <w:pPr>
-              <w:keepLines/>
-              <w:spacing w:after="20"/>
-            </w:pPr>
             <w:r>
-              <w:rPr>
-                <w:rFonts w:ascii="Consolas" w:hAnsi="Consolas"/>
-                <w:b w:val="0"/>
-                <w:color w:val="50406E"/>
-                <w:sz w:val="17"/>
-              </w:rPr>
-              <w:t>BATCH_LOG.md</w:t>
+              <w:t>`BATCH_LOG.md`</w:t>
             </w:r>
           </w:p>
         </w:tc>
         <w:tc>
           <w:tcPr>
-            <w:tcW w:type="dxa" w:w="5040"/>
-            <w:vAlign w:val="center"/>
+            <w:tcW w:type="dxa" w:w="4320"/>
           </w:tcPr>
           <w:p>
-            <w:pPr>
-              <w:keepLines/>
-              <w:spacing w:after="20"/>
-            </w:pPr>
             <w:r>
-              <w:rPr>
-                <w:rFonts w:ascii="Aptos" w:hAnsi="Aptos"/>
-                <w:b w:val="0"/>
-                <w:sz w:val="17"/>
-              </w:rPr>
               <w:t>Chronological batch catalog</w:t>
             </w:r>
           </w:p>
@@ -1335,41 +1408,20 @@
       <w:tr>
         <w:tc>
           <w:tcPr>
-            <w:tcW w:type="dxa" w:w="5040"/>
-            <w:vAlign w:val="center"/>
+            <w:tcW w:type="dxa" w:w="4320"/>
           </w:tcPr>
           <w:p>
-            <w:pPr>
-              <w:keepLines/>
-              <w:spacing w:after="20"/>
-            </w:pPr>
             <w:r>
-              <w:rPr>
-                <w:rFonts w:ascii="Consolas" w:hAnsi="Consolas"/>
-                <w:b w:val="0"/>
-                <w:color w:val="50406E"/>
-                <w:sz w:val="17"/>
-              </w:rPr>
-              <w:t>Batches/THREADS.md</w:t>
+              <w:t>`Batches/THREADS.md`</w:t>
             </w:r>
           </w:p>
         </w:tc>
         <w:tc>
           <w:tcPr>
-            <w:tcW w:type="dxa" w:w="5040"/>
-            <w:vAlign w:val="center"/>
+            <w:tcW w:type="dxa" w:w="4320"/>
           </w:tcPr>
           <w:p>
-            <w:pPr>
-              <w:keepLines/>
-              <w:spacing w:after="20"/>
-            </w:pPr>
             <w:r>
-              <w:rPr>
-                <w:rFonts w:ascii="Aptos" w:hAnsi="Aptos"/>
-                <w:b w:val="0"/>
-                <w:sz w:val="17"/>
-              </w:rPr>
               <w:t>Series-neutral thematic classification</w:t>
             </w:r>
           </w:p>
@@ -1378,41 +1430,20 @@
       <w:tr>
         <w:tc>
           <w:tcPr>
-            <w:tcW w:type="dxa" w:w="5040"/>
-            <w:vAlign w:val="center"/>
+            <w:tcW w:type="dxa" w:w="4320"/>
           </w:tcPr>
           <w:p>
-            <w:pPr>
-              <w:keepLines/>
-              <w:spacing w:after="20"/>
-            </w:pPr>
             <w:r>
-              <w:rPr>
-                <w:rFonts w:ascii="Consolas" w:hAnsi="Consolas"/>
-                <w:b w:val="0"/>
-                <w:color w:val="50406E"/>
-                <w:sz w:val="17"/>
-              </w:rPr>
-              <w:t>VERSION_MAP.md</w:t>
+              <w:t>`VERSION_MAP.md`</w:t>
             </w:r>
           </w:p>
         </w:tc>
         <w:tc>
           <w:tcPr>
-            <w:tcW w:type="dxa" w:w="5040"/>
-            <w:vAlign w:val="center"/>
+            <w:tcW w:type="dxa" w:w="4320"/>
           </w:tcPr>
           <w:p>
-            <w:pPr>
-              <w:keepLines/>
-              <w:spacing w:after="20"/>
-            </w:pPr>
             <w:r>
-              <w:rPr>
-                <w:rFonts w:ascii="Aptos" w:hAnsi="Aptos"/>
-                <w:b w:val="0"/>
-                <w:sz w:val="17"/>
-              </w:rPr>
               <w:t>Chronological, tier-bearing version units</w:t>
             </w:r>
           </w:p>
@@ -1421,41 +1452,20 @@
       <w:tr>
         <w:tc>
           <w:tcPr>
-            <w:tcW w:type="dxa" w:w="5040"/>
-            <w:vAlign w:val="center"/>
+            <w:tcW w:type="dxa" w:w="4320"/>
           </w:tcPr>
           <w:p>
-            <w:pPr>
-              <w:keepLines/>
-              <w:spacing w:after="20"/>
-            </w:pPr>
             <w:r>
-              <w:rPr>
-                <w:rFonts w:ascii="Consolas" w:hAnsi="Consolas"/>
-                <w:b w:val="0"/>
-                <w:color w:val="50406E"/>
-                <w:sz w:val="17"/>
-              </w:rPr>
-              <w:t>tools/version-model.mjs</w:t>
+              <w:t>`tools/version-model.mjs`</w:t>
             </w:r>
           </w:p>
         </w:tc>
         <w:tc>
           <w:tcPr>
-            <w:tcW w:type="dxa" w:w="5040"/>
-            <w:vAlign w:val="center"/>
+            <w:tcW w:type="dxa" w:w="4320"/>
           </w:tcPr>
           <w:p>
-            <w:pPr>
-              <w:keepLines/>
-              <w:spacing w:after="20"/>
-            </w:pPr>
             <w:r>
-              <w:rPr>
-                <w:rFonts w:ascii="Aptos" w:hAnsi="Aptos"/>
-                <w:b w:val="0"/>
-                <w:sz w:val="17"/>
-              </w:rPr>
               <w:t>Version replay, generated stamps, and structural checks</w:t>
             </w:r>
           </w:p>
@@ -1464,41 +1474,20 @@
       <w:tr>
         <w:tc>
           <w:tcPr>
-            <w:tcW w:type="dxa" w:w="5040"/>
-            <w:vAlign w:val="center"/>
+            <w:tcW w:type="dxa" w:w="4320"/>
           </w:tcPr>
           <w:p>
-            <w:pPr>
-              <w:keepLines/>
-              <w:spacing w:after="20"/>
-            </w:pPr>
             <w:r>
-              <w:rPr>
-                <w:rFonts w:ascii="Consolas" w:hAnsi="Consolas"/>
-                <w:b w:val="0"/>
-                <w:color w:val="50406E"/>
-                <w:sz w:val="17"/>
-              </w:rPr>
-              <w:t>B10_CAUSAL_PROVENANCE_AUDIT.md</w:t>
+              <w:t>`B10_CAUSAL_PROVENANCE_AUDIT.md`</w:t>
             </w:r>
           </w:p>
         </w:tc>
         <w:tc>
           <w:tcPr>
-            <w:tcW w:type="dxa" w:w="5040"/>
-            <w:vAlign w:val="center"/>
+            <w:tcW w:type="dxa" w:w="4320"/>
           </w:tcPr>
           <w:p>
-            <w:pPr>
-              <w:keepLines/>
-              <w:spacing w:after="20"/>
-            </w:pPr>
             <w:r>
-              <w:rPr>
-                <w:rFonts w:ascii="Aptos" w:hAnsi="Aptos"/>
-                <w:b w:val="0"/>
-                <w:sz w:val="17"/>
-              </w:rPr>
               <w:t>Current causal owners, corrected proxies, program contracts, and institution-asset classifications</w:t>
             </w:r>
           </w:p>
@@ -1507,41 +1496,20 @@
       <w:tr>
         <w:tc>
           <w:tcPr>
-            <w:tcW w:type="dxa" w:w="5040"/>
-            <w:vAlign w:val="center"/>
+            <w:tcW w:type="dxa" w:w="4320"/>
           </w:tcPr>
           <w:p>
-            <w:pPr>
-              <w:keepLines/>
-              <w:spacing w:after="20"/>
-            </w:pPr>
             <w:r>
-              <w:rPr>
-                <w:rFonts w:ascii="Consolas" w:hAnsi="Consolas"/>
-                <w:b w:val="0"/>
-                <w:color w:val="50406E"/>
-                <w:sz w:val="17"/>
-              </w:rPr>
-              <w:t>MODULE_OWNERSHIP.md</w:t>
+              <w:t>`MODULE_OWNERSHIP.md`</w:t>
             </w:r>
           </w:p>
         </w:tc>
         <w:tc>
           <w:tcPr>
-            <w:tcW w:type="dxa" w:w="5040"/>
-            <w:vAlign w:val="center"/>
+            <w:tcW w:type="dxa" w:w="4320"/>
           </w:tcPr>
           <w:p>
-            <w:pPr>
-              <w:keepLines/>
-              <w:spacing w:after="20"/>
-            </w:pPr>
             <w:r>
-              <w:rPr>
-                <w:rFonts w:ascii="Aptos" w:hAnsi="Aptos"/>
-                <w:b w:val="0"/>
-                <w:sz w:val="17"/>
-              </w:rPr>
               <w:t>Authoritative module, mutation, cadence, cache, and diagnostics ownership</w:t>
             </w:r>
           </w:p>
@@ -1550,75 +1518,20 @@
       <w:tr>
         <w:tc>
           <w:tcPr>
-            <w:tcW w:type="dxa" w:w="5040"/>
-            <w:vAlign w:val="center"/>
+            <w:tcW w:type="dxa" w:w="4320"/>
           </w:tcPr>
           <w:p>
-            <w:pPr>
-              <w:keepLines/>
-              <w:spacing w:after="20"/>
-            </w:pPr>
             <w:r>
-              <w:rPr>
-                <w:rFonts w:ascii="Consolas" w:hAnsi="Consolas"/>
-                <w:b w:val="0"/>
-                <w:color w:val="50406E"/>
-                <w:sz w:val="17"/>
-              </w:rPr>
-              <w:t>SCHEMA_REGISTRY.md</w:t>
-            </w:r>
-            <w:r>
-              <w:rPr>
-                <w:rFonts w:ascii="Aptos" w:hAnsi="Aptos"/>
-                <w:b w:val="0"/>
-                <w:sz w:val="17"/>
-              </w:rPr>
-              <w:t xml:space="preserve">, </w:t>
-            </w:r>
-            <w:r>
-              <w:rPr>
-                <w:rFonts w:ascii="Consolas" w:hAnsi="Consolas"/>
-                <w:b w:val="0"/>
-                <w:color w:val="50406E"/>
-                <w:sz w:val="17"/>
-              </w:rPr>
-              <w:t>PERSISTENCE_CENSUS.md</w:t>
-            </w:r>
-            <w:r>
-              <w:rPr>
-                <w:rFonts w:ascii="Aptos" w:hAnsi="Aptos"/>
-                <w:b w:val="0"/>
-                <w:sz w:val="17"/>
-              </w:rPr>
-              <w:t xml:space="preserve">, </w:t>
-            </w:r>
-            <w:r>
-              <w:rPr>
-                <w:rFonts w:ascii="Consolas" w:hAnsi="Consolas"/>
-                <w:b w:val="0"/>
-                <w:color w:val="50406E"/>
-                <w:sz w:val="17"/>
-              </w:rPr>
-              <w:t>CAMPAIGN_COMPATIBILITY.md</w:t>
+              <w:t>`SCHEMA_REGISTRY.md`, `PERSISTENCE_CENSUS.md`, `CAMPAIGN_COMPATIBILITY.md`</w:t>
             </w:r>
           </w:p>
         </w:tc>
         <w:tc>
           <w:tcPr>
-            <w:tcW w:type="dxa" w:w="5040"/>
-            <w:vAlign w:val="center"/>
+            <w:tcW w:type="dxa" w:w="4320"/>
           </w:tcPr>
           <w:p>
-            <w:pPr>
-              <w:keepLines/>
-              <w:spacing w:after="20"/>
-            </w:pPr>
             <w:r>
-              <w:rPr>
-                <w:rFonts w:ascii="Aptos" w:hAnsi="Aptos"/>
-                <w:b w:val="0"/>
-                <w:sz w:val="17"/>
-              </w:rPr>
               <w:t>Durable campaign schema, independent source-writer census, preflight, migration, update, and rollback contracts</w:t>
             </w:r>
           </w:p>
@@ -1627,41 +1540,20 @@
       <w:tr>
         <w:tc>
           <w:tcPr>
-            <w:tcW w:type="dxa" w:w="5040"/>
-            <w:vAlign w:val="center"/>
+            <w:tcW w:type="dxa" w:w="4320"/>
           </w:tcPr>
           <w:p>
-            <w:pPr>
-              <w:keepLines/>
-              <w:spacing w:after="20"/>
-            </w:pPr>
             <w:r>
-              <w:rPr>
-                <w:rFonts w:ascii="Consolas" w:hAnsi="Consolas"/>
-                <w:b w:val="0"/>
-                <w:color w:val="50406E"/>
-                <w:sz w:val="17"/>
-              </w:rPr>
-              <w:t>AUTHORING_ONTOLOGY_COVERAGE.md</w:t>
+              <w:t>`AUTHORING_ONTOLOGY_COVERAGE.md`</w:t>
             </w:r>
           </w:p>
         </w:tc>
         <w:tc>
           <w:tcPr>
-            <w:tcW w:type="dxa" w:w="5040"/>
-            <w:vAlign w:val="center"/>
+            <w:tcW w:type="dxa" w:w="4320"/>
           </w:tcPr>
           <w:p>
-            <w:pPr>
-              <w:keepLines/>
-              <w:spacing w:after="20"/>
-            </w:pPr>
             <w:r>
-              <w:rPr>
-                <w:rFonts w:ascii="Aptos" w:hAnsi="Aptos"/>
-                <w:b w:val="0"/>
-                <w:sz w:val="17"/>
-              </w:rPr>
               <w:t>Production social/political vocabulary, mechanics coverage, control contracts, categories, and exclusions</w:t>
             </w:r>
           </w:p>
@@ -1670,58 +1562,20 @@
       <w:tr>
         <w:tc>
           <w:tcPr>
-            <w:tcW w:type="dxa" w:w="5040"/>
-            <w:vAlign w:val="center"/>
+            <w:tcW w:type="dxa" w:w="4320"/>
           </w:tcPr>
           <w:p>
-            <w:pPr>
-              <w:keepLines/>
-              <w:spacing w:after="20"/>
-            </w:pPr>
             <w:r>
-              <w:rPr>
-                <w:rFonts w:ascii="Consolas" w:hAnsi="Consolas"/>
-                <w:b w:val="0"/>
-                <w:color w:val="50406E"/>
-                <w:sz w:val="17"/>
-              </w:rPr>
-              <w:t>B16_PLAYABLE_SOCIAL_ONTOLOGY_AUDIT.md</w:t>
-            </w:r>
-            <w:r>
-              <w:rPr>
-                <w:rFonts w:ascii="Aptos" w:hAnsi="Aptos"/>
-                <w:b w:val="0"/>
-                <w:sz w:val="17"/>
-              </w:rPr>
-              <w:t xml:space="preserve">, </w:t>
-            </w:r>
-            <w:r>
-              <w:rPr>
-                <w:rFonts w:ascii="Consolas" w:hAnsi="Consolas"/>
-                <w:b w:val="0"/>
-                <w:color w:val="50406E"/>
-                <w:sz w:val="17"/>
-              </w:rPr>
-              <w:t>AUTHORING_ONTOLOGY_COVERAGE.md</w:t>
+              <w:t>`B16_PLAYABLE_SOCIAL_ONTOLOGY_AUDIT.md`, `AUTHORING_ONTOLOGY_COVERAGE.md`</w:t>
             </w:r>
           </w:p>
         </w:tc>
         <w:tc>
           <w:tcPr>
-            <w:tcW w:type="dxa" w:w="5040"/>
-            <w:vAlign w:val="center"/>
+            <w:tcW w:type="dxa" w:w="4320"/>
           </w:tcPr>
           <w:p>
-            <w:pPr>
-              <w:keepLines/>
-              <w:spacing w:after="20"/>
-            </w:pPr>
             <w:r>
-              <w:rPr>
-                <w:rFonts w:ascii="Aptos" w:hAnsi="Aptos"/>
-                <w:b w:val="0"/>
-                <w:sz w:val="17"/>
-              </w:rPr>
               <w:t>Current forty-eight-question Culture registry, exact Ideoligion and native-event semantic adapters, ownership audit, mechanics coverage, consumers, and fail-closed mod boundary</w:t>
             </w:r>
           </w:p>
@@ -1730,41 +1584,42 @@
       <w:tr>
         <w:tc>
           <w:tcPr>
-            <w:tcW w:type="dxa" w:w="5040"/>
-            <w:vAlign w:val="center"/>
+            <w:tcW w:type="dxa" w:w="4320"/>
           </w:tcPr>
           <w:p>
-            <w:pPr>
-              <w:keepLines/>
-              <w:spacing w:after="20"/>
-            </w:pPr>
             <w:r>
-              <w:rPr>
-                <w:rFonts w:ascii="Consolas" w:hAnsi="Consolas"/>
-                <w:b w:val="0"/>
-                <w:color w:val="50406E"/>
-                <w:sz w:val="17"/>
-              </w:rPr>
-              <w:t>B13_CAUSAL_CONTRACT.md</w:t>
+              <w:t>`B17_SITE_AFFILIATION_AND_EPISTEMIC_CONTRACT.md`</w:t>
             </w:r>
           </w:p>
         </w:tc>
         <w:tc>
           <w:tcPr>
-            <w:tcW w:type="dxa" w:w="5040"/>
-            <w:vAlign w:val="center"/>
+            <w:tcW w:type="dxa" w:w="4320"/>
           </w:tcPr>
           <w:p>
-            <w:pPr>
-              <w:keepLines/>
-              <w:spacing w:after="20"/>
-            </w:pPr>
             <w:r>
-              <w:rPr>
-                <w:rFonts w:ascii="Aptos" w:hAnsi="Aptos"/>
-                <w:b w:val="0"/>
-                <w:sz w:val="17"/>
-              </w:rPr>
+              <w:t>Typed ownership/support across inhabited sites, complete factionless social state, scale-transition rules, and the optional broader pawn-knowledge contract</w:t>
+            </w:r>
+          </w:p>
+        </w:tc>
+      </w:tr>
+      <w:tr>
+        <w:tc>
+          <w:tcPr>
+            <w:tcW w:type="dxa" w:w="4320"/>
+          </w:tcPr>
+          <w:p>
+            <w:r>
+              <w:t>`B13_CAUSAL_CONTRACT.md`</w:t>
+            </w:r>
+          </w:p>
+        </w:tc>
+        <w:tc>
+          <w:tcPr>
+            <w:tcW w:type="dxa" w:w="4320"/>
+          </w:tcPr>
+          <w:p>
+            <w:r>
               <w:t>Historical twenty-four-question B13 Culture boundary retained beneath B16</w:t>
             </w:r>
           </w:p>
@@ -1773,41 +1628,20 @@
       <w:tr>
         <w:tc>
           <w:tcPr>
-            <w:tcW w:type="dxa" w:w="5040"/>
-            <w:vAlign w:val="center"/>
+            <w:tcW w:type="dxa" w:w="4320"/>
           </w:tcPr>
           <w:p>
-            <w:pPr>
-              <w:keepLines/>
-              <w:spacing w:after="20"/>
-            </w:pPr>
             <w:r>
-              <w:rPr>
-                <w:rFonts w:ascii="Consolas" w:hAnsi="Consolas"/>
-                <w:b w:val="0"/>
-                <w:color w:val="50406E"/>
-                <w:sz w:val="17"/>
-              </w:rPr>
-              <w:t>CULTURE_RESEARCH_CORPUS.md</w:t>
+              <w:t>`CULTURE_RESEARCH_CORPUS.md`</w:t>
             </w:r>
           </w:p>
         </w:tc>
         <w:tc>
           <w:tcPr>
-            <w:tcW w:type="dxa" w:w="5040"/>
-            <w:vAlign w:val="center"/>
+            <w:tcW w:type="dxa" w:w="4320"/>
           </w:tcPr>
           <w:p>
-            <w:pPr>
-              <w:keepLines/>
-              <w:spacing w:after="20"/>
-            </w:pPr>
             <w:r>
-              <w:rPr>
-                <w:rFonts w:ascii="Aptos" w:hAnsi="Aptos"/>
-                <w:b w:val="0"/>
-                <w:sz w:val="17"/>
-              </w:rPr>
               <w:t>Current Culture research and playable-mechanics corpus: B13 source basis plus B16 reverse ownership audit, causal separations, consumers, feedback, and calibration limits</w:t>
             </w:r>
           </w:p>
@@ -1816,41 +1650,20 @@
       <w:tr>
         <w:tc>
           <w:tcPr>
-            <w:tcW w:type="dxa" w:w="5040"/>
-            <w:vAlign w:val="center"/>
+            <w:tcW w:type="dxa" w:w="4320"/>
           </w:tcPr>
           <w:p>
-            <w:pPr>
-              <w:keepLines/>
-              <w:spacing w:after="20"/>
-            </w:pPr>
             <w:r>
-              <w:rPr>
-                <w:rFonts w:ascii="Consolas" w:hAnsi="Consolas"/>
-                <w:b w:val="0"/>
-                <w:color w:val="50406E"/>
-                <w:sz w:val="17"/>
-              </w:rPr>
-              <w:t>REGIONAL_GEOGRAPHY_CONTRACT.md</w:t>
+              <w:t>`REGIONAL_GEOGRAPHY_CONTRACT.md`</w:t>
             </w:r>
           </w:p>
         </w:tc>
         <w:tc>
           <w:tcPr>
-            <w:tcW w:type="dxa" w:w="5040"/>
-            <w:vAlign w:val="center"/>
+            <w:tcW w:type="dxa" w:w="4320"/>
           </w:tcPr>
           <w:p>
-            <w:pPr>
-              <w:keepLines/>
-              <w:spacing w:after="20"/>
-            </w:pPr>
             <w:r>
-              <w:rPr>
-                <w:rFonts w:ascii="Aptos" w:hAnsi="Aptos"/>
-                <w:b w:val="0"/>
-                <w:sz w:val="17"/>
-              </w:rPr>
               <w:t>Shared B14 preview and generation identity, supported geography combinations, and fail-closed realization rules</w:t>
             </w:r>
           </w:p>
@@ -1859,41 +1672,20 @@
       <w:tr>
         <w:tc>
           <w:tcPr>
-            <w:tcW w:type="dxa" w:w="5040"/>
-            <w:vAlign w:val="center"/>
+            <w:tcW w:type="dxa" w:w="4320"/>
           </w:tcPr>
           <w:p>
-            <w:pPr>
-              <w:keepLines/>
-              <w:spacing w:after="20"/>
-            </w:pPr>
             <w:r>
-              <w:rPr>
-                <w:rFonts w:ascii="Consolas" w:hAnsi="Consolas"/>
-                <w:b w:val="0"/>
-                <w:color w:val="50406E"/>
-                <w:sz w:val="17"/>
-              </w:rPr>
-              <w:t>B15_TECHNOLOGICAL_KNOWLEDGE_CONTRACT.md</w:t>
+              <w:t>`B15_TECHNOLOGICAL_KNOWLEDGE_CONTRACT.md`</w:t>
             </w:r>
           </w:p>
         </w:tc>
         <w:tc>
           <w:tcPr>
-            <w:tcW w:type="dxa" w:w="5040"/>
-            <w:vAlign w:val="center"/>
+            <w:tcW w:type="dxa" w:w="4320"/>
           </w:tcPr>
           <w:p>
-            <w:pPr>
-              <w:keepLines/>
-              <w:spacing w:after="20"/>
-            </w:pPr>
             <w:r>
-              <w:rPr>
-                <w:rFonts w:ascii="Aptos" w:hAnsi="Aptos"/>
-                <w:b w:val="0"/>
-                <w:sz w:val="17"/>
-              </w:rPr>
               <w:t>Faction-owned technological domains, Society composition, native translation, and standard/distributed availability</w:t>
             </w:r>
           </w:p>
@@ -1902,76 +1694,21 @@
       <w:tr>
         <w:tc>
           <w:tcPr>
-            <w:tcW w:type="dxa" w:w="5040"/>
-            <w:vAlign w:val="center"/>
+            <w:tcW w:type="dxa" w:w="4320"/>
           </w:tcPr>
           <w:p>
-            <w:pPr>
-              <w:keepLines/>
-              <w:spacing w:after="20"/>
-            </w:pPr>
             <w:r>
-              <w:rPr>
-                <w:rFonts w:ascii="Consolas" w:hAnsi="Consolas"/>
-                <w:b w:val="0"/>
-                <w:color w:val="50406E"/>
-                <w:sz w:val="17"/>
-              </w:rPr>
-              <w:t>PLAYER_BASE_PATTERN_CORPUS.md</w:t>
-            </w:r>
-            <w:r>
-              <w:rPr>
-                <w:rFonts w:ascii="Aptos" w:hAnsi="Aptos"/>
-                <w:b w:val="0"/>
-                <w:sz w:val="17"/>
-              </w:rPr>
-              <w:t xml:space="preserve">, </w:t>
-            </w:r>
-            <w:r>
-              <w:rPr>
-                <w:rFonts w:ascii="Consolas" w:hAnsi="Consolas"/>
-                <w:b w:val="0"/>
-                <w:color w:val="50406E"/>
-                <w:sz w:val="17"/>
-              </w:rPr>
-              <w:t>Corpus/PlayerBaseLayouts/</w:t>
-            </w:r>
-            <w:r>
-              <w:rPr>
-                <w:rFonts w:ascii="Aptos" w:hAnsi="Aptos"/>
-                <w:b w:val="0"/>
-                <w:sz w:val="17"/>
-              </w:rPr>
-              <w:t xml:space="preserve">, </w:t>
-            </w:r>
-            <w:r>
-              <w:rPr>
-                <w:rFonts w:ascii="Consolas" w:hAnsi="Consolas"/>
-                <w:b w:val="0"/>
-                <w:color w:val="50406E"/>
-                <w:sz w:val="17"/>
-              </w:rPr>
-              <w:t>tools/PlayerBaseLayoutExtractor/</w:t>
+              <w:t>`DATASET_GOVERNANCE.md`</w:t>
             </w:r>
           </w:p>
         </w:tc>
         <w:tc>
           <w:tcPr>
-            <w:tcW w:type="dxa" w:w="5040"/>
-            <w:vAlign w:val="center"/>
+            <w:tcW w:type="dxa" w:w="4320"/>
           </w:tcPr>
           <w:p>
-            <w:pPr>
-              <w:keepLines/>
-              <w:spacing w:after="20"/>
-            </w:pPr>
             <w:r>
-              <w:rPr>
-                <w:rFonts w:ascii="Aptos" w:hAnsi="Aptos"/>
-                <w:b w:val="0"/>
-                <w:sz w:val="17"/>
-              </w:rPr>
-              <w:t>Full-save and structured-snapshot layouts, exact provenance and evidence limits, normalized spatial data, and reusable construction relationships; no copied plan or style mode</w:t>
+              <w:t>Public corpus strata, provenance, acquisition, processing, privacy, IP, cohort, and use-accounting boundary; underlying examples remain local</w:t>
             </w:r>
           </w:p>
         </w:tc>
@@ -1979,58 +1716,42 @@
       <w:tr>
         <w:tc>
           <w:tcPr>
-            <w:tcW w:type="dxa" w:w="5040"/>
-            <w:vAlign w:val="center"/>
+            <w:tcW w:type="dxa" w:w="4320"/>
           </w:tcPr>
           <w:p>
-            <w:pPr>
-              <w:keepLines/>
-              <w:spacing w:after="20"/>
-            </w:pPr>
             <w:r>
-              <w:rPr>
-                <w:rFonts w:ascii="Consolas" w:hAnsi="Consolas"/>
-                <w:b w:val="0"/>
-                <w:color w:val="50406E"/>
-                <w:sz w:val="17"/>
-              </w:rPr>
-              <w:t>CULTURAL_COGNITION_RESEARCH.md</w:t>
-            </w:r>
-            <w:r>
-              <w:rPr>
-                <w:rFonts w:ascii="Aptos" w:hAnsi="Aptos"/>
-                <w:b w:val="0"/>
-                <w:sz w:val="17"/>
-              </w:rPr>
-              <w:t xml:space="preserve">, </w:t>
-            </w:r>
-            <w:r>
-              <w:rPr>
-                <w:rFonts w:ascii="Consolas" w:hAnsi="Consolas"/>
-                <w:b w:val="0"/>
-                <w:color w:val="50406E"/>
-                <w:sz w:val="17"/>
-              </w:rPr>
-              <w:t>B12_CULTURE_QUESTION_AUDIT.md</w:t>
+              <w:t>`PLAYER_BASE_PATTERN_CORPUS.md`, `Corpus/PlayerBaseLayouts/`, `tools/PlayerBaseLayoutExtractor/`</w:t>
             </w:r>
           </w:p>
         </w:tc>
         <w:tc>
           <w:tcPr>
-            <w:tcW w:type="dxa" w:w="5040"/>
-            <w:vAlign w:val="center"/>
+            <w:tcW w:type="dxa" w:w="4320"/>
           </w:tcPr>
           <w:p>
-            <w:pPr>
-              <w:keepLines/>
-              <w:spacing w:after="20"/>
-            </w:pPr>
             <w:r>
-              <w:rPr>
-                <w:rFonts w:ascii="Aptos" w:hAnsi="Aptos"/>
-                <w:b w:val="0"/>
-                <w:sz w:val="17"/>
-              </w:rPr>
+              <w:t>Layout methodology, evidence limits, aggregate profile, extraction schema, and reusable construction relationships; normalized spatial records and exact cohort membership remain local and ignored</w:t>
+            </w:r>
+          </w:p>
+        </w:tc>
+      </w:tr>
+      <w:tr>
+        <w:tc>
+          <w:tcPr>
+            <w:tcW w:type="dxa" w:w="4320"/>
+          </w:tcPr>
+          <w:p>
+            <w:r>
+              <w:t>`CULTURAL_COGNITION_RESEARCH.md`, `B12_CULTURE_QUESTION_AUDIT.md`</w:t>
+            </w:r>
+          </w:p>
+        </w:tc>
+        <w:tc>
+          <w:tcPr>
+            <w:tcW w:type="dxa" w:w="4320"/>
+          </w:tcPr>
+          <w:p>
+            <w:r>
               <w:t>B12 research and migration evidence retained beneath the B13 completion</w:t>
             </w:r>
           </w:p>
@@ -2039,459 +1760,407 @@
       <w:tr>
         <w:tc>
           <w:tcPr>
-            <w:tcW w:type="dxa" w:w="5040"/>
-            <w:vAlign w:val="center"/>
+            <w:tcW w:type="dxa" w:w="4320"/>
           </w:tcPr>
           <w:p>
-            <w:pPr>
-              <w:keepLines/>
-              <w:spacing w:after="20"/>
-            </w:pPr>
             <w:r>
-              <w:rPr>
-                <w:rFonts w:ascii="Consolas" w:hAnsi="Consolas"/>
-                <w:b w:val="0"/>
-                <w:color w:val="50406E"/>
-                <w:sz w:val="17"/>
-              </w:rPr>
-              <w:t>B13_ACCEPTANCE_RECEIPTS.md</w:t>
-            </w:r>
-            <w:r>
-              <w:rPr>
-                <w:rFonts w:ascii="Aptos" w:hAnsi="Aptos"/>
-                <w:b w:val="0"/>
-                <w:sz w:val="17"/>
-              </w:rPr>
-              <w:t xml:space="preserve">, </w:t>
-            </w:r>
-            <w:r>
-              <w:rPr>
-                <w:rFonts w:ascii="Consolas" w:hAnsi="Consolas"/>
-                <w:b w:val="0"/>
-                <w:color w:val="50406E"/>
-                <w:sz w:val="17"/>
-              </w:rPr>
-              <w:t>B13_REVIEW_RECEIPT.md</w:t>
-            </w:r>
-            <w:r>
-              <w:rPr>
-                <w:rFonts w:ascii="Aptos" w:hAnsi="Aptos"/>
-                <w:b w:val="0"/>
-                <w:sz w:val="17"/>
-              </w:rPr>
-              <w:t xml:space="preserve">, </w:t>
-            </w:r>
-            <w:r>
-              <w:rPr>
-                <w:rFonts w:ascii="Consolas" w:hAnsi="Consolas"/>
-                <w:b w:val="0"/>
-                <w:color w:val="50406E"/>
-                <w:sz w:val="17"/>
-              </w:rPr>
-              <w:t>Receipts/B14/</w:t>
-            </w:r>
-            <w:r>
-              <w:rPr>
-                <w:rFonts w:ascii="Aptos" w:hAnsi="Aptos"/>
-                <w:b w:val="0"/>
-                <w:sz w:val="17"/>
-              </w:rPr>
-              <w:t xml:space="preserve">, </w:t>
-            </w:r>
-            <w:r>
-              <w:rPr>
-                <w:rFonts w:ascii="Consolas" w:hAnsi="Consolas"/>
-                <w:b w:val="0"/>
-                <w:color w:val="50406E"/>
-                <w:sz w:val="17"/>
-              </w:rPr>
-              <w:t>Receipts/B15/</w:t>
-            </w:r>
-            <w:r>
-              <w:rPr>
-                <w:rFonts w:ascii="Aptos" w:hAnsi="Aptos"/>
-                <w:b w:val="0"/>
-                <w:sz w:val="17"/>
-              </w:rPr>
-              <w:t xml:space="preserve">, </w:t>
-            </w:r>
-            <w:r>
-              <w:rPr>
-                <w:rFonts w:ascii="Consolas" w:hAnsi="Consolas"/>
-                <w:b w:val="0"/>
-                <w:color w:val="50406E"/>
-                <w:sz w:val="17"/>
-              </w:rPr>
-              <w:t>Receipts/B16/</w:t>
+              <w:t>`B13_ACCEPTANCE_RECEIPTS.md`, `B13_REVIEW_RECEIPT.md`, `Receipts/B14/`, `Receipts/B15/`, `Receipts/B16/`, `Receipts/B17/`</w:t>
             </w:r>
           </w:p>
         </w:tc>
         <w:tc>
           <w:tcPr>
-            <w:tcW w:type="dxa" w:w="5040"/>
-            <w:vAlign w:val="center"/>
+            <w:tcW w:type="dxa" w:w="4320"/>
           </w:tcPr>
           <w:p>
-            <w:pPr>
-              <w:keepLines/>
-              <w:spacing w:after="20"/>
-            </w:pPr>
             <w:r>
-              <w:rPr>
-                <w:rFonts w:ascii="Aptos" w:hAnsi="Aptos"/>
-                <w:b w:val="0"/>
-                <w:sz w:val="17"/>
-              </w:rPr>
               <w:t>Executable closure, retained-regression, review, fixture, build, and deployment evidence</w:t>
             </w:r>
           </w:p>
         </w:tc>
       </w:tr>
     </w:tbl>
+    <w:p/>
     <w:p>
       <w:pPr>
-        <w:spacing w:after="20"/>
-      </w:pPr>
-    </w:p>
-    <w:p>
-      <w:pPr>
-        <w:pStyle w:val="Heading1"/>
+        <w:pStyle w:val="Heading2"/>
       </w:pPr>
       <w:r>
-        <w:rPr>
-          <w:rFonts w:ascii="Aptos" w:hAnsi="Aptos"/>
-          <w:b w:val="0"/>
-          <w:sz w:val="21"/>
-        </w:rPr>
         <w:t>Project history</w:t>
+      </w:r>
+    </w:p>
+    <w:p/>
+    <w:p>
+      <w:r>
+        <w:t>The governed batch and provenance records are the portable project history.</w:t>
       </w:r>
     </w:p>
     <w:p>
       <w:r>
-        <w:rPr>
-          <w:rFonts w:ascii="Aptos" w:hAnsi="Aptos"/>
-          <w:b w:val="0"/>
-          <w:sz w:val="21"/>
-        </w:rPr>
-        <w:t xml:space="preserve">The governed batch and provenance records are the portable project history. They travel with the current tree and do not depend on a particular Git host. </w:t>
-      </w:r>
-      <w:r>
-        <w:rPr>
-          <w:rFonts w:ascii="Consolas" w:hAnsi="Consolas"/>
-          <w:b w:val="0"/>
-          <w:color w:val="50406E"/>
-          <w:sz w:val="18"/>
-        </w:rPr>
-        <w:t>A1</w:t>
-      </w:r>
-      <w:r>
-        <w:rPr>
-          <w:rFonts w:ascii="Aptos" w:hAnsi="Aptos"/>
-          <w:b w:val="0"/>
-          <w:sz w:val="21"/>
-        </w:rPr>
-        <w:t xml:space="preserve"> through </w:t>
-      </w:r>
-      <w:r>
-        <w:rPr>
-          <w:rFonts w:ascii="Consolas" w:hAnsi="Consolas"/>
-          <w:b w:val="0"/>
-          <w:color w:val="50406E"/>
-          <w:sz w:val="18"/>
-        </w:rPr>
-        <w:t>A102</w:t>
-      </w:r>
-      <w:r>
-        <w:rPr>
-          <w:rFonts w:ascii="Aptos" w:hAnsi="Aptos"/>
-          <w:b w:val="0"/>
-          <w:sz w:val="21"/>
-        </w:rPr>
-        <w:t xml:space="preserve"> and the continuing </w:t>
-      </w:r>
-      <w:r>
-        <w:rPr>
-          <w:rFonts w:ascii="Consolas" w:hAnsi="Consolas"/>
-          <w:b w:val="0"/>
-          <w:color w:val="50406E"/>
-          <w:sz w:val="18"/>
-        </w:rPr>
-        <w:t>B</w:t>
-      </w:r>
-      <w:r>
-        <w:rPr>
-          <w:rFonts w:ascii="Aptos" w:hAnsi="Aptos"/>
-          <w:b w:val="0"/>
-          <w:sz w:val="21"/>
-        </w:rPr>
-        <w:t xml:space="preserve"> batches share one chronological namespace under </w:t>
-      </w:r>
-      <w:hyperlink r:id="rId12">
-        <w:r>
-          <w:rPr>
-            <w:color w:val="2F5597"/>
-            <w:u w:val="single"/>
-          </w:rPr>
-          <w:t>`Batches/`</w:t>
-        </w:r>
-      </w:hyperlink>
-      <w:r>
-        <w:rPr>
-          <w:rFonts w:ascii="Aptos" w:hAnsi="Aptos"/>
-          <w:b w:val="0"/>
-          <w:sz w:val="21"/>
-        </w:rPr>
-        <w:t xml:space="preserve">. </w:t>
-      </w:r>
-      <w:hyperlink r:id="rId13">
-        <w:r>
-          <w:rPr>
-            <w:color w:val="2F5597"/>
-            <w:u w:val="single"/>
-          </w:rPr>
-          <w:t>`BATCH_LOG.md`</w:t>
-        </w:r>
-      </w:hyperlink>
-      <w:r>
-        <w:rPr>
-          <w:rFonts w:ascii="Aptos" w:hAnsi="Aptos"/>
-          <w:b w:val="0"/>
-          <w:sz w:val="21"/>
-        </w:rPr>
-        <w:t xml:space="preserve"> is the chronological view, </w:t>
-      </w:r>
-      <w:hyperlink r:id="rId14">
-        <w:r>
-          <w:rPr>
-            <w:color w:val="2F5597"/>
-            <w:u w:val="single"/>
-          </w:rPr>
-          <w:t>`Batches/THREADS.md`</w:t>
-        </w:r>
-      </w:hyperlink>
-      <w:r>
-        <w:rPr>
-          <w:rFonts w:ascii="Aptos" w:hAnsi="Aptos"/>
-          <w:b w:val="0"/>
-          <w:sz w:val="21"/>
-        </w:rPr>
-        <w:t xml:space="preserve"> connects related work across time, and </w:t>
-      </w:r>
-      <w:hyperlink r:id="rId15">
-        <w:r>
-          <w:rPr>
-            <w:color w:val="2F5597"/>
-            <w:u w:val="single"/>
-          </w:rPr>
-          <w:t>`VERSION_MAP.md`</w:t>
-        </w:r>
-      </w:hyperlink>
-      <w:r>
-        <w:rPr>
-          <w:rFonts w:ascii="Aptos" w:hAnsi="Aptos"/>
-          <w:b w:val="0"/>
-          <w:sz w:val="21"/>
-        </w:rPr>
-        <w:t xml:space="preserve"> partitions contiguous development into capability-coherent version units under the four-coordinate odometer.</w:t>
+        <w:t>They travel with the current tree and do not depend on a particular Git host.</w:t>
       </w:r>
     </w:p>
     <w:p>
       <w:r>
-        <w:rPr>
-          <w:rFonts w:ascii="Aptos" w:hAnsi="Aptos"/>
-          <w:b w:val="0"/>
-          <w:sz w:val="21"/>
-        </w:rPr>
+        <w:t>`A1` through `A102` and the continuing `B` batches share one chronological</w:t>
+      </w:r>
+    </w:p>
+    <w:p>
+      <w:r>
+        <w:t>namespace under [`Batches/`](Batches/). [`BATCH_LOG.md`](BATCH_LOG.md) is the</w:t>
+      </w:r>
+    </w:p>
+    <w:p>
+      <w:r>
+        <w:t>chronological view, [`Batches/THREADS.md`](Batches/THREADS.md) connects related</w:t>
+      </w:r>
+    </w:p>
+    <w:p>
+      <w:r>
+        <w:t>work across time, and [`VERSION_MAP.md`](VERSION_MAP.md) partitions contiguous</w:t>
+      </w:r>
+    </w:p>
+    <w:p>
+      <w:r>
+        <w:t>development into capability-coherent version units under the four-coordinate</w:t>
+      </w:r>
+    </w:p>
+    <w:p>
+      <w:r>
+        <w:t>odometer.</w:t>
+      </w:r>
+    </w:p>
+    <w:p/>
+    <w:p>
+      <w:r>
         <w:t>Run the governance check with:</w:t>
       </w:r>
     </w:p>
+    <w:p/>
     <w:p>
-      <w:pPr>
-        <w:ind w:left="360" w:right="216"/>
-      </w:pPr>
       <w:r>
         <w:rPr>
           <w:rFonts w:ascii="Consolas" w:hAnsi="Consolas"/>
-          <w:color w:val="37414B"/>
-          <w:sz w:val="17"/>
+          <w:sz w:val="18"/>
         </w:rPr>
         <w:t>node tools/version-model.mjs --check</w:t>
       </w:r>
     </w:p>
+    <w:p/>
     <w:p>
       <w:r>
-        <w:rPr>
-          <w:rFonts w:ascii="Aptos" w:hAnsi="Aptos"/>
-          <w:b w:val="0"/>
-          <w:sz w:val="21"/>
-        </w:rPr>
-        <w:t>Local Git may retain engineering history. A published forge is a distribution surface, not the project identity or the authority for its portable history.</w:t>
-      </w:r>
-    </w:p>
-    <w:p>
-      <w:pPr>
-        <w:pStyle w:val="Heading1"/>
-      </w:pPr>
-      <w:r>
-        <w:rPr>
-          <w:rFonts w:ascii="Aptos" w:hAnsi="Aptos"/>
-          <w:b w:val="0"/>
-          <w:sz w:val="21"/>
-        </w:rPr>
-        <w:t>Verification boundary</w:t>
+        <w:t>Local Git may retain engineering history. A published forge is a distribution</w:t>
       </w:r>
     </w:p>
     <w:p>
       <w:r>
-        <w:rPr>
-          <w:rFonts w:ascii="Aptos" w:hAnsi="Aptos"/>
-          <w:b w:val="0"/>
-          <w:sz w:val="21"/>
-        </w:rPr>
-        <w:t xml:space="preserve">Executable receipts cover authoring ownership, creation navigation, founding state, World tendencies, behavior authorization, Culture distributions, psychology, private/public attitudes, sparse influence, political formation, institutional legitimacy and sanctions, proposition knowledge, Culture history, domestic identity, capability evidence, operational programs, provision operators, fixture/runtime equivalence, and derived-state stability. Static receipts, builds, hashes, and reviews establish that a candidate is ready for the operator; they do not establish how the game looks or plays. See </w:t>
-      </w:r>
-      <w:hyperlink r:id="rId16">
-        <w:r>
-          <w:rPr>
-            <w:color w:val="2F5597"/>
-            <w:u w:val="single"/>
-          </w:rPr>
-          <w:t>`SESSION_STATE.md`</w:t>
-        </w:r>
-      </w:hyperlink>
-      <w:r>
-        <w:rPr>
-          <w:rFonts w:ascii="Aptos" w:hAnsi="Aptos"/>
-          <w:b w:val="0"/>
-          <w:sz w:val="21"/>
-        </w:rPr>
-        <w:t xml:space="preserve"> for the exact current assembly, deployment, fixture, and remaining RimWorld observations.</w:t>
+        <w:t>surface, not the project identity or the authority for its portable history.</w:t>
       </w:r>
     </w:p>
+    <w:p/>
     <w:p>
       <w:pPr>
-        <w:pStyle w:val="Heading1"/>
+        <w:pStyle w:val="Heading2"/>
       </w:pPr>
       <w:r>
-        <w:rPr>
-          <w:rFonts w:ascii="Aptos" w:hAnsi="Aptos"/>
-          <w:b w:val="0"/>
-          <w:sz w:val="21"/>
-        </w:rPr>
-        <w:t>License and provenance</w:t>
+        <w:t>Working capability and assessment</w:t>
+      </w:r>
+    </w:p>
+    <w:p/>
+    <w:p>
+      <w:r>
+        <w:t>Executable receipts cover authoring ownership, creation navigation, founding</w:t>
       </w:r>
     </w:p>
     <w:p>
       <w:r>
-        <w:rPr>
-          <w:rFonts w:ascii="Aptos" w:hAnsi="Aptos"/>
-          <w:b w:val="0"/>
-          <w:sz w:val="21"/>
-        </w:rPr>
-        <w:t xml:space="preserve">Colonist Awareness is licensed under GPL-3.0. See </w:t>
-      </w:r>
-      <w:hyperlink r:id="rId17">
-        <w:r>
-          <w:rPr>
-            <w:color w:val="2F5597"/>
-            <w:u w:val="single"/>
-          </w:rPr>
-          <w:t>`LICENSE`</w:t>
-        </w:r>
-      </w:hyperlink>
-      <w:r>
-        <w:rPr>
-          <w:rFonts w:ascii="Aptos" w:hAnsi="Aptos"/>
-          <w:b w:val="0"/>
-          <w:sz w:val="21"/>
-        </w:rPr>
-        <w:t xml:space="preserve">, </w:t>
-      </w:r>
-      <w:hyperlink r:id="rId18">
-        <w:r>
-          <w:rPr>
-            <w:color w:val="2F5597"/>
-            <w:u w:val="single"/>
-          </w:rPr>
-          <w:t>`CREDITS.md`</w:t>
-        </w:r>
-      </w:hyperlink>
-      <w:r>
-        <w:rPr>
-          <w:rFonts w:ascii="Aptos" w:hAnsi="Aptos"/>
-          <w:b w:val="0"/>
-          <w:sz w:val="21"/>
-        </w:rPr>
-        <w:t xml:space="preserve">, and </w:t>
-      </w:r>
-      <w:hyperlink r:id="rId19">
-        <w:r>
-          <w:rPr>
-            <w:color w:val="2F5597"/>
-            <w:u w:val="single"/>
-          </w:rPr>
-          <w:t>`UPSTREAM_SOURCES.md`</w:t>
-        </w:r>
-      </w:hyperlink>
-      <w:r>
-        <w:rPr>
-          <w:rFonts w:ascii="Aptos" w:hAnsi="Aptos"/>
-          <w:b w:val="0"/>
-          <w:sz w:val="21"/>
-        </w:rPr>
-        <w:t xml:space="preserve"> for attribution and incorporated-source provenance.</w:t>
+        <w:t>state, World tendencies, behavior authorization, Culture distributions,</w:t>
       </w:r>
     </w:p>
+    <w:p>
+      <w:r>
+        <w:t>psychology, private/public attitudes, sparse influence, political formation,</w:t>
+      </w:r>
+    </w:p>
+    <w:p>
+      <w:r>
+        <w:t>institutional legitimacy and sanctions, proposition knowledge, Culture history,</w:t>
+      </w:r>
+    </w:p>
+    <w:p>
+      <w:r>
+        <w:t>domestic identity, capability evidence, operational programs, provision</w:t>
+      </w:r>
+    </w:p>
+    <w:p>
+      <w:r>
+        <w:t>operators, fixture/runtime equivalence, and derived-state stability.</w:t>
+      </w:r>
+    </w:p>
+    <w:p/>
+    <w:p>
+      <w:r>
+        <w:t>Repeated native runs and operator play already establish working emergency/work</w:t>
+      </w:r>
+    </w:p>
+    <w:p>
+      <w:r>
+        <w:t>autonomy, construction and storage, hauling, tactical behavior, regional generation,</w:t>
+      </w:r>
+    </w:p>
+    <w:p>
+      <w:r>
+        <w:t>and campaign creation/save/reload. The linked observations below support those</w:t>
+      </w:r>
+    </w:p>
+    <w:p>
+      <w:r>
+        <w:t>behaviors and outcomes. Neo recovers further feedback and fixes as development</w:t>
+      </w:r>
+    </w:p>
+    <w:p>
+      <w:r>
+        <w:t>continues and keeps this assessment current.</w:t>
+      </w:r>
+    </w:p>
+    <w:p/>
+    <w:tbl>
+      <w:tblPr>
+        <w:tblStyle w:val="TableGrid"/>
+        <w:tblW w:type="auto" w:w="0"/>
+        <w:tblLook w:firstColumn="1" w:firstRow="1" w:lastColumn="0" w:lastRow="0" w:noHBand="0" w:noVBand="1" w:val="04A0"/>
+      </w:tblPr>
+      <w:tblGrid>
+        <w:gridCol w:w="4320"/>
+        <w:gridCol w:w="4320"/>
+      </w:tblGrid>
+      <w:tr>
+        <w:tc>
+          <w:tcPr>
+            <w:tcW w:type="dxa" w:w="4320"/>
+          </w:tcPr>
+          <w:p>
+            <w:r>
+              <w:t>Working group</w:t>
+            </w:r>
+          </w:p>
+        </w:tc>
+        <w:tc>
+          <w:tcPr>
+            <w:tcW w:type="dxa" w:w="4320"/>
+          </w:tcPr>
+          <w:p>
+            <w:r>
+              <w:t>Retained evidence</w:t>
+            </w:r>
+          </w:p>
+        </w:tc>
+      </w:tr>
+      <w:tr>
+        <w:tc>
+          <w:tcPr>
+            <w:tcW w:type="dxa" w:w="4320"/>
+          </w:tcPr>
+          <w:p>
+            <w:r>
+              <w:t>Emergency/work autonomy</w:t>
+            </w:r>
+          </w:p>
+        </w:tc>
+        <w:tc>
+          <w:tcPr>
+            <w:tcW w:type="dxa" w:w="4320"/>
+          </w:tcPr>
+          <w:p>
+            <w:r>
+              <w:t>[F-39](FINDINGS.md): native fire fixtures exercised approach, extinguishing and repair.</w:t>
+            </w:r>
+          </w:p>
+        </w:tc>
+      </w:tr>
+      <w:tr>
+        <w:tc>
+          <w:tcPr>
+            <w:tcW w:type="dxa" w:w="4320"/>
+          </w:tcPr>
+          <w:p>
+            <w:r>
+              <w:t>Construction, storage and hauling</w:t>
+            </w:r>
+          </w:p>
+        </w:tc>
+        <w:tc>
+          <w:tcPr>
+            <w:tcW w:type="dxa" w:w="4320"/>
+          </w:tcPr>
+          <w:p>
+            <w:r>
+              <w:t>[F-72/F-74](FINDINGS.md): operator accepted placement, stockpile access and native medical hauling.</w:t>
+            </w:r>
+          </w:p>
+        </w:tc>
+      </w:tr>
+      <w:tr>
+        <w:tc>
+          <w:tcPr>
+            <w:tcW w:type="dxa" w:w="4320"/>
+          </w:tcPr>
+          <w:p>
+            <w:r>
+              <w:t>Tactical behavior</w:t>
+            </w:r>
+          </w:p>
+        </w:tc>
+        <w:tc>
+          <w:tcPr>
+            <w:tcW w:type="dxa" w:w="4320"/>
+          </w:tcPr>
+          <w:p>
+            <w:r>
+              <w:t>[F-108 and later battle findings](FINDINGS.md): actual native combat retained movement, contact-breaking and materially improved behavior.</w:t>
+            </w:r>
+          </w:p>
+        </w:tc>
+      </w:tr>
+      <w:tr>
+        <w:tc>
+          <w:tcPr>
+            <w:tcW w:type="dxa" w:w="4320"/>
+          </w:tcPr>
+          <w:p>
+            <w:r>
+              <w:t>Regional generation</w:t>
+            </w:r>
+          </w:p>
+        </w:tc>
+        <w:tc>
+          <w:tcPr>
+            <w:tcW w:type="dxa" w:w="4320"/>
+          </w:tcPr>
+          <w:p>
+            <w:r>
+              <w:t>[B14 runtime receipt](Receipts/B14/B14_GENERATION_RUNTIME_RECEIPT.md): four settlements materialized with their ownership, populations and relationships; the operator reported an impressive live map.</w:t>
+            </w:r>
+          </w:p>
+        </w:tc>
+      </w:tr>
+      <w:tr>
+        <w:tc>
+          <w:tcPr>
+            <w:tcW w:type="dxa" w:w="4320"/>
+          </w:tcPr>
+          <w:p>
+            <w:r>
+              <w:t>Society and knowledge custody</w:t>
+            </w:r>
+          </w:p>
+        </w:tc>
+        <w:tc>
+          <w:tcPr>
+            <w:tcW w:type="dxa" w:w="4320"/>
+          </w:tcPr>
+          <w:p>
+            <w:r>
+              <w:t>[B15 execution receipt](Receipts/B15/B15_TECHNOLOGICAL_KNOWLEDGE_EXECUTION_RECEIPT.md): Society targets apply atomically and survive saved-state readback; local knowledge availability follows carrier custody, loss, incapacity and recovery.</w:t>
+            </w:r>
+          </w:p>
+        </w:tc>
+      </w:tr>
+      <w:tr>
+        <w:tc>
+          <w:tcPr>
+            <w:tcW w:type="dxa" w:w="4320"/>
+          </w:tcPr>
+          <w:p>
+            <w:r>
+              <w:t>Settlement materials and work</w:t>
+            </w:r>
+          </w:p>
+        </w:tc>
+        <w:tc>
+          <w:tcPr>
+            <w:tcW w:type="dxa" w:w="4320"/>
+          </w:tcPr>
+          <w:p>
+            <w:r>
+              <w:t>[B19 substrate receipt](Receipts/B19/B19_REGIONAL_SUBSTRATE_ACCEPTANCE_RECEIPT.md): construction materials follow represented capacity and Culture; settlement roles produce distinct works and shared defenses once.</w:t>
+            </w:r>
+          </w:p>
+        </w:tc>
+      </w:tr>
+      <w:tr>
+        <w:tc>
+          <w:tcPr>
+            <w:tcW w:type="dxa" w:w="4320"/>
+          </w:tcPr>
+          <w:p>
+            <w:r>
+              <w:t>Campaign operation and durability</w:t>
+            </w:r>
+          </w:p>
+        </w:tc>
+        <w:tc>
+          <w:tcPr>
+            <w:tcW w:type="dxa" w:w="4320"/>
+          </w:tcPr>
+          <w:p>
+            <w:r>
+              <w:t>[B18 performance receipt](Receipts/B18/B18_PERFORMANCE_RECEIPT.md): repeated creation, speed changes, raid/fire, full simulation days, save and reload.</w:t>
+            </w:r>
+          </w:p>
+        </w:tc>
+      </w:tr>
+    </w:tbl>
+    <w:p/>
+    <w:p>
+      <w:r>
+        <w:t>Neo maintains this summary from actual work and feedback. See</w:t>
+      </w:r>
+    </w:p>
+    <w:p>
+      <w:r>
+        <w:t>[`SESSION_STATE.md`](SESSION_STATE.md) for the current implementation, deployment</w:t>
+      </w:r>
+    </w:p>
+    <w:p>
+      <w:r>
+        <w:t>and specific continuing work.</w:t>
+      </w:r>
+    </w:p>
+    <w:p/>
+    <w:p>
+      <w:pPr>
+        <w:pStyle w:val="Heading2"/>
+      </w:pPr>
+      <w:r>
+        <w:t>License and provenance</w:t>
+      </w:r>
+    </w:p>
+    <w:p/>
+    <w:p>
+      <w:r>
+        <w:t>Colonist Awareness is licensed under GPL-3.0. See [`LICENSE`](LICENSE),</w:t>
+      </w:r>
+    </w:p>
+    <w:p>
+      <w:r>
+        <w:t>[`CREDITS.md`](CREDITS.md), and [`UPSTREAM_SOURCES.md`](UPSTREAM_SOURCES.md) for</w:t>
+      </w:r>
+    </w:p>
+    <w:p>
+      <w:r>
+        <w:t>attribution and incorporated-source provenance.</w:t>
+      </w:r>
+    </w:p>
+    <w:p/>
     <w:sectPr>
-      <w:headerReference w:type="default" r:id="rId9"/>
-      <w:footerReference w:type="default" r:id="rId10"/>
       <w:pgSz w:w="12240" w:h="15840"/>
-      <w:pgMar w:top="1008" w:right="1080" w:bottom="1008" w:left="1080" w:header="432" w:footer="432" w:gutter="0"/>
+      <w:pgMar w:top="1440" w:right="1800" w:bottom="1440" w:left="1800" w:header="720" w:footer="720" w:gutter="0"/>
       <w:cols w:space="720"/>
       <w:docGrid w:linePitch="360"/>
     </w:sectPr>
   </w:body>
 </w:document>
-</file>
-
-<file path=word/footer1.xml><?xml version="1.0" encoding="utf-8"?>
-<w:ftr xmlns:m="http://schemas.openxmlformats.org/officeDocument/2006/math" xmlns:mc="http://schemas.openxmlformats.org/markup-compatibility/2006" xmlns:mo="http://schemas.microsoft.com/office/mac/office/2008/main" xmlns:mv="urn:schemas-microsoft-com:mac:vml" xmlns:o="urn:schemas-microsoft-com:office:office" xmlns:r="http://schemas.openxmlformats.org/officeDocument/2006/relationships" xmlns:v="urn:schemas-microsoft-com:vml" xmlns:w10="urn:schemas-microsoft-com:office:word" xmlns:w14="http://schemas.microsoft.com/office/word/2010/wordml" xmlns:w="http://schemas.openxmlformats.org/wordprocessingml/2006/main" xmlns:wne="http://schemas.microsoft.com/office/word/2006/wordml" xmlns:wp14="http://schemas.microsoft.com/office/word/2010/wordprocessingDrawing" xmlns:wp="http://schemas.openxmlformats.org/drawingml/2006/wordprocessingDrawing" xmlns:wpc="http://schemas.microsoft.com/office/word/2010/wordprocessingCanvas" xmlns:wpg="http://schemas.microsoft.com/office/word/2010/wordprocessingGroup" xmlns:wpi="http://schemas.microsoft.com/office/word/2010/wordprocessingInk" xmlns:wps="http://schemas.microsoft.com/office/word/2010/wordprocessingShape" mc:Ignorable="w14 wp14">
-  <w:p>
-    <w:pPr>
-      <w:pStyle w:val="Footer"/>
-      <w:jc w:val="center"/>
-    </w:pPr>
-    <w:r>
-      <w:rPr>
-        <w:rFonts w:ascii="Aptos" w:hAnsi="Aptos"/>
-        <w:color w:val="6E7882"/>
-        <w:sz w:val="16"/>
-      </w:rPr>
-      <w:t xml:space="preserve">Governed project README  ?  </w:t>
-    </w:r>
-    <w:fldSimple w:instr="PAGE"/>
-  </w:p>
-</w:ftr>
-</file>
-
-<file path=word/header1.xml><?xml version="1.0" encoding="utf-8"?>
-<w:hdr xmlns:m="http://schemas.openxmlformats.org/officeDocument/2006/math" xmlns:mc="http://schemas.openxmlformats.org/markup-compatibility/2006" xmlns:mo="http://schemas.microsoft.com/office/mac/office/2008/main" xmlns:mv="urn:schemas-microsoft-com:mac:vml" xmlns:o="urn:schemas-microsoft-com:office:office" xmlns:r="http://schemas.openxmlformats.org/officeDocument/2006/relationships" xmlns:v="urn:schemas-microsoft-com:vml" xmlns:w10="urn:schemas-microsoft-com:office:word" xmlns:w14="http://schemas.microsoft.com/office/word/2010/wordml" xmlns:w="http://schemas.openxmlformats.org/wordprocessingml/2006/main" xmlns:wne="http://schemas.microsoft.com/office/word/2006/wordml" xmlns:wp14="http://schemas.microsoft.com/office/word/2010/wordprocessingDrawing" xmlns:wp="http://schemas.openxmlformats.org/drawingml/2006/wordprocessingDrawing" xmlns:wpc="http://schemas.microsoft.com/office/word/2010/wordprocessingCanvas" xmlns:wpg="http://schemas.microsoft.com/office/word/2010/wordprocessingGroup" xmlns:wpi="http://schemas.microsoft.com/office/word/2010/wordprocessingInk" xmlns:wps="http://schemas.microsoft.com/office/word/2010/wordprocessingShape" mc:Ignorable="w14 wp14">
-  <w:p>
-    <w:pPr>
-      <w:pStyle w:val="Header"/>
-      <w:jc w:val="right"/>
-    </w:pPr>
-    <w:r>
-      <w:rPr>
-        <w:rFonts w:ascii="Aptos" w:hAnsi="Aptos"/>
-        <w:b/>
-        <w:color w:val="5A6978"/>
-        <w:sz w:val="16"/>
-      </w:rPr>
-      <w:t>COLONIST AWARENESS  ?  1.6.1.0-alpha</w:t>
-    </w:r>
-  </w:p>
-</w:hdr>
 </file>
 
 <file path=word/numbering.xml><?xml version="1.0" encoding="utf-8"?>
@@ -2857,13 +2526,6 @@
     <w:name w:val="Normal"/>
     <w:qFormat/>
     <w:rsid w:val="00FC693F"/>
-    <w:pPr>
-      <w:spacing w:after="100" w:line="259" w:lineRule="auto"/>
-    </w:pPr>
-    <w:rPr>
-      <w:rFonts w:ascii="Aptos" w:hAnsi="Aptos"/>
-      <w:sz w:val="21"/>
-    </w:rPr>
   </w:style>
   <w:style w:type="paragraph" w:styleId="Header">
     <w:name w:val="header"/>
@@ -2920,15 +2582,15 @@
     <w:pPr>
       <w:keepNext/>
       <w:keepLines/>
-      <w:spacing w:before="200" w:after="100"/>
+      <w:spacing w:before="480" w:after="0"/>
       <w:outlineLvl w:val="0"/>
     </w:pPr>
     <w:rPr>
-      <w:rFonts w:asciiTheme="majorHAnsi" w:eastAsiaTheme="majorEastAsia" w:hAnsiTheme="majorHAnsi" w:cstheme="majorBidi" w:ascii="Aptos Display" w:hAnsi="Aptos Display"/>
+      <w:rFonts w:asciiTheme="majorHAnsi" w:eastAsiaTheme="majorEastAsia" w:hAnsiTheme="majorHAnsi" w:cstheme="majorBidi"/>
       <w:b/>
       <w:bCs/>
-      <w:color w:val="17365D"/>
-      <w:sz w:val="36"/>
+      <w:color w:val="365F91" w:themeColor="accent1" w:themeShade="BF"/>
+      <w:sz w:val="28"/>
       <w:szCs w:val="28"/>
     </w:rPr>
   </w:style>
@@ -2944,15 +2606,15 @@
     <w:pPr>
       <w:keepNext/>
       <w:keepLines/>
-      <w:spacing w:before="200" w:after="100"/>
+      <w:spacing w:before="200" w:after="0"/>
       <w:outlineLvl w:val="1"/>
     </w:pPr>
     <w:rPr>
-      <w:rFonts w:asciiTheme="majorHAnsi" w:eastAsiaTheme="majorEastAsia" w:hAnsiTheme="majorHAnsi" w:cstheme="majorBidi" w:ascii="Aptos Display" w:hAnsi="Aptos Display"/>
+      <w:rFonts w:asciiTheme="majorHAnsi" w:eastAsiaTheme="majorEastAsia" w:hAnsiTheme="majorHAnsi" w:cstheme="majorBidi"/>
       <w:b/>
       <w:bCs/>
-      <w:color w:val="2F5597"/>
-      <w:sz w:val="28"/>
+      <w:color w:val="4F81BD" w:themeColor="accent1"/>
+      <w:sz w:val="26"/>
       <w:szCs w:val="26"/>
     </w:rPr>
   </w:style>
@@ -2968,15 +2630,14 @@
     <w:pPr>
       <w:keepNext/>
       <w:keepLines/>
-      <w:spacing w:before="200" w:after="100"/>
+      <w:spacing w:before="200" w:after="0"/>
       <w:outlineLvl w:val="2"/>
     </w:pPr>
     <w:rPr>
-      <w:rFonts w:asciiTheme="majorHAnsi" w:eastAsiaTheme="majorEastAsia" w:hAnsiTheme="majorHAnsi" w:cstheme="majorBidi" w:ascii="Aptos Display" w:hAnsi="Aptos Display"/>
+      <w:rFonts w:asciiTheme="majorHAnsi" w:eastAsiaTheme="majorEastAsia" w:hAnsiTheme="majorHAnsi" w:cstheme="majorBidi"/>
       <w:b/>
       <w:bCs/>
-      <w:color w:val="2F5597"/>
-      <w:sz w:val="23"/>
+      <w:color w:val="4F81BD" w:themeColor="accent1"/>
     </w:rPr>
   </w:style>
   <w:style w:type="paragraph" w:styleId="Heading4">
@@ -3207,20 +2868,18 @@
     <w:qFormat/>
     <w:rsid w:val="00FC693F"/>
     <w:pPr>
-      <w:keepNext/>
       <w:pBdr>
         <w:bottom w:val="single" w:sz="8" w:space="4" w:color="4F81BD" w:themeColor="accent1"/>
       </w:pBdr>
-      <w:spacing w:after="100" w:line="240" w:lineRule="auto" w:before="0"/>
+      <w:spacing w:after="300" w:line="240" w:lineRule="auto"/>
       <w:contextualSpacing/>
     </w:pPr>
     <w:rPr>
-      <w:rFonts w:asciiTheme="majorHAnsi" w:eastAsiaTheme="majorEastAsia" w:hAnsiTheme="majorHAnsi" w:cstheme="majorBidi" w:ascii="Aptos Display" w:hAnsi="Aptos Display"/>
-      <w:b/>
-      <w:color w:val="17365D"/>
+      <w:rFonts w:asciiTheme="majorHAnsi" w:eastAsiaTheme="majorEastAsia" w:hAnsiTheme="majorHAnsi" w:cstheme="majorBidi"/>
+      <w:color w:val="17365D" w:themeColor="text2" w:themeShade="BF"/>
       <w:spacing w:val="5"/>
       <w:kern w:val="28"/>
-      <w:sz w:val="56"/>
+      <w:sz w:val="52"/>
       <w:szCs w:val="52"/>
     </w:rPr>
   </w:style>

</xml_diff>